<commit_message>
Audit des phases 67 à 75 : rapport, guide de reprise, carte du code, consigne Codex, sommaire de la documentation (§15.175)
Co-Authored-By: Claude Opus 5.5 <noreply@anthropic.com>
</commit_message>
<xml_diff>
--- a/docs/developpement/GUIDE_DE_REPRISE.docx
+++ b/docs/developpement/GUIDE_DE_REPRISE.docx
@@ -18,19 +18,28 @@
         <w:shd w:fill="F6F3FF" w:color="auto" w:val="clear"/>
       </w:pPr>
       <w:r>
-        <w:t xml:space="preserve">Écrit le 2026-10-19, à jour de la phase 66 (migration </w:t>
-      </w:r>
-      <w:r>
-        <w:rPr>
-          <w:rFonts w:ascii="Consolas" w:cs="Consolas" w:eastAsia="Consolas" w:hAnsi="Consolas"/>
-          <w:color w:val="3B2F8F"/>
-          <w:sz w:val="18"/>
-          <w:szCs w:val="18"/>
-        </w:rPr>
-        <w:t xml:space="preserve">0053</w:t>
-      </w:r>
-      <w:r>
-        <w:t xml:space="preserve">). À relire en premier ; il dit où aller pour tout le reste.</w:t>
+        <w:t xml:space="preserve">Écrit le 2026-10-19, </w:t>
+      </w:r>
+      <w:r>
+        <w:rPr>
+          <w:b/>
+          <w:bCs/>
+        </w:rPr>
+        <w:t xml:space="preserve">mis à jour le 2026-10-25 : phase 76, migration </w:t>
+      </w:r>
+      <w:r>
+        <w:rPr>
+          <w:rFonts w:ascii="Consolas" w:cs="Consolas" w:eastAsia="Consolas" w:hAnsi="Consolas"/>
+          <w:b/>
+          <w:bCs/>
+          <w:color w:val="3B2F8F"/>
+          <w:sz w:val="18"/>
+          <w:szCs w:val="18"/>
+        </w:rPr>
+        <w:t xml:space="preserve">0058</w:t>
+      </w:r>
+      <w:r>
+        <w:t xml:space="preserve">. À relire en premier ; il dit où aller pour tout le reste. Ce qui a été construit depuis la phase 66 est résumé au § 6 bis.</w:t>
       </w:r>
     </w:p>
     <w:p>
@@ -441,7 +450,7 @@
                 <w:sz w:val="18"/>
                 <w:szCs w:val="18"/>
               </w:rPr>
-              <w:t xml:space="preserve"> Chaque décision prise avec Rémi, avec ses mots, son raisonnement, ce qui a été construit et testé. La partie §15 suit le développement section par section (§15.93 → §15.165).</w:t>
+              <w:t xml:space="preserve"> Chaque décision prise avec Rémi, avec ses mots, son raisonnement, ce qui a été construit et testé. La partie §15 suit le développement section par section (§15.93 → §15.175).</w:t>
             </w:r>
           </w:p>
         </w:tc>
@@ -500,7 +509,7 @@
                 <w:sz w:val="18"/>
                 <w:szCs w:val="18"/>
               </w:rPr>
-              <w:t xml:space="preserve">Où en est le projet, ce qui attend Rémi, ce qui est à faire au passage en production.</w:t>
+              <w:t xml:space="preserve">Où en est le projet, séance par séance, et ce qui est à faire au passage en production.</w:t>
             </w:r>
           </w:p>
         </w:tc>
@@ -533,7 +542,7 @@
                 <w:sz w:val="18"/>
                 <w:szCs w:val="18"/>
               </w:rPr>
-              <w:t xml:space="preserve">docs/decisions-architecture-production.md</w:t>
+              <w:t xml:space="preserve">docs/points-a-revoir.md</w:t>
             </w:r>
           </w:p>
         </w:tc>
@@ -556,10 +565,19 @@
           <w:p>
             <w:r>
               <w:rPr>
-                <w:sz w:val="18"/>
-                <w:szCs w:val="18"/>
-              </w:rPr>
-              <w:t xml:space="preserve">Choix d'architecture validés (§ 10), questions ouvertes (§ 11), incident Docker du poste de Rémi (§ 13).</w:t>
+                <w:b/>
+                <w:bCs/>
+                <w:sz w:val="18"/>
+                <w:szCs w:val="18"/>
+              </w:rPr>
+              <w:t xml:space="preserve">La liste tenue à jour</w:t>
+            </w:r>
+            <w:r>
+              <w:rPr>
+                <w:sz w:val="18"/>
+                <w:szCs w:val="18"/>
+              </w:rPr>
+              <w:t xml:space="preserve"> de ce qui attend Rémi (comptes, clés, tests, décisions) et des développements suivants.</w:t>
             </w:r>
           </w:p>
         </w:tc>
@@ -592,23 +610,7 @@
                 <w:sz w:val="18"/>
                 <w:szCs w:val="18"/>
               </w:rPr>
-              <w:t xml:space="preserve">JOURNAL_DES_PHASES.md</w:t>
-            </w:r>
-            <w:r>
-              <w:rPr>
-                <w:sz w:val="18"/>
-                <w:szCs w:val="18"/>
-              </w:rPr>
-              <w:t xml:space="preserve"> et </w:t>
-            </w:r>
-            <w:r>
-              <w:rPr>
-                <w:rFonts w:ascii="Consolas" w:cs="Consolas" w:eastAsia="Consolas" w:hAnsi="Consolas"/>
-                <w:color w:val="3B2F8F"/>
-                <w:sz w:val="18"/>
-                <w:szCs w:val="18"/>
-              </w:rPr>
-              <w:t xml:space="preserve">phases/</w:t>
+              <w:t xml:space="preserve">docs/decisions-architecture-production.md</w:t>
             </w:r>
           </w:p>
         </w:tc>
@@ -634,23 +636,7 @@
                 <w:sz w:val="18"/>
                 <w:szCs w:val="18"/>
               </w:rPr>
-              <w:t xml:space="preserve">Les 67 phases de construction (0 → 66), dans l'ordre : pour chacune, une fiche en Markdown </w:t>
-            </w:r>
-            <w:r>
-              <w:rPr>
-                <w:b/>
-                <w:bCs/>
-                <w:sz w:val="18"/>
-                <w:szCs w:val="18"/>
-              </w:rPr>
-              <w:t xml:space="preserve">et en Word</w:t>
-            </w:r>
-            <w:r>
-              <w:rPr>
-                <w:sz w:val="18"/>
-                <w:szCs w:val="18"/>
-              </w:rPr>
-              <w:t xml:space="preserve"> (décision, commits, fichiers par couche, tests, comment reprendre).</w:t>
+              <w:t xml:space="preserve">Choix d'architecture validés (§ 10), questions ouvertes (§ 11), incident Docker du poste de Rémi (§ 13).</w:t>
             </w:r>
           </w:p>
         </w:tc>
@@ -683,7 +669,23 @@
                 <w:sz w:val="18"/>
                 <w:szCs w:val="18"/>
               </w:rPr>
-              <w:t xml:space="preserve">CARTE_DU_CODE.md</w:t>
+              <w:t xml:space="preserve">JOURNAL_DES_PHASES.md</w:t>
+            </w:r>
+            <w:r>
+              <w:rPr>
+                <w:sz w:val="18"/>
+                <w:szCs w:val="18"/>
+              </w:rPr>
+              <w:t xml:space="preserve"> et </w:t>
+            </w:r>
+            <w:r>
+              <w:rPr>
+                <w:rFonts w:ascii="Consolas" w:cs="Consolas" w:eastAsia="Consolas" w:hAnsi="Consolas"/>
+                <w:color w:val="3B2F8F"/>
+                <w:sz w:val="18"/>
+                <w:szCs w:val="18"/>
+              </w:rPr>
+              <w:t xml:space="preserve">phases/</w:t>
             </w:r>
           </w:p>
         </w:tc>
@@ -709,7 +711,23 @@
                 <w:sz w:val="18"/>
                 <w:szCs w:val="18"/>
               </w:rPr>
-              <w:t xml:space="preserve">Où est quoi dans le code, et la ligne exacte des fonctions et routes clés.</w:t>
+              <w:t xml:space="preserve">Les 77 phases de construction (0 → 76), dans l'ordre : pour chacune, une fiche en Markdown </w:t>
+            </w:r>
+            <w:r>
+              <w:rPr>
+                <w:b/>
+                <w:bCs/>
+                <w:sz w:val="18"/>
+                <w:szCs w:val="18"/>
+              </w:rPr>
+              <w:t xml:space="preserve">et en Word</w:t>
+            </w:r>
+            <w:r>
+              <w:rPr>
+                <w:sz w:val="18"/>
+                <w:szCs w:val="18"/>
+              </w:rPr>
+              <w:t xml:space="preserve"> (décision, commits, fichiers par couche, tests, comment reprendre).</w:t>
             </w:r>
           </w:p>
         </w:tc>
@@ -742,7 +760,7 @@
                 <w:sz w:val="18"/>
                 <w:szCs w:val="18"/>
               </w:rPr>
-              <w:t xml:space="preserve">CHANGELOG.md</w:t>
+              <w:t xml:space="preserve">CARTE_DU_CODE.md</w:t>
             </w:r>
           </w:p>
         </w:tc>
@@ -768,7 +786,7 @@
                 <w:sz w:val="18"/>
                 <w:szCs w:val="18"/>
               </w:rPr>
-              <w:t xml:space="preserve">Tous les commits, regroupés par phase.</w:t>
+              <w:t xml:space="preserve">Où est quoi dans le code, et la ligne exacte des fonctions et routes clés.</w:t>
             </w:r>
           </w:p>
         </w:tc>
@@ -801,23 +819,7 @@
                 <w:sz w:val="18"/>
                 <w:szCs w:val="18"/>
               </w:rPr>
-              <w:t xml:space="preserve">docs/conformite/</w:t>
-            </w:r>
-            <w:r>
-              <w:rPr>
-                <w:sz w:val="18"/>
-                <w:szCs w:val="18"/>
-              </w:rPr>
-              <w:t xml:space="preserve">, </w:t>
-            </w:r>
-            <w:r>
-              <w:rPr>
-                <w:rFonts w:ascii="Consolas" w:cs="Consolas" w:eastAsia="Consolas" w:hAnsi="Consolas"/>
-                <w:color w:val="3B2F8F"/>
-                <w:sz w:val="18"/>
-                <w:szCs w:val="18"/>
-              </w:rPr>
-              <w:t xml:space="preserve">docs/questions-expert-comptable.md</w:t>
+              <w:t xml:space="preserve">CHANGELOG.md</w:t>
             </w:r>
           </w:p>
         </w:tc>
@@ -843,7 +845,7 @@
                 <w:sz w:val="18"/>
                 <w:szCs w:val="18"/>
               </w:rPr>
-              <w:t xml:space="preserve">Dossier de conformité du système de caisse ; questions fiscales encore ouvertes (NF525…).</w:t>
+              <w:t xml:space="preserve">Tous les commits, regroupés par phase.</w:t>
             </w:r>
           </w:p>
         </w:tc>
@@ -876,7 +878,23 @@
                 <w:sz w:val="18"/>
                 <w:szCs w:val="18"/>
               </w:rPr>
-              <w:t xml:space="preserve">docs/guide-serveur-test-ovh.md</w:t>
+              <w:t xml:space="preserve">docs/conformite/</w:t>
+            </w:r>
+            <w:r>
+              <w:rPr>
+                <w:sz w:val="18"/>
+                <w:szCs w:val="18"/>
+              </w:rPr>
+              <w:t xml:space="preserve">, </w:t>
+            </w:r>
+            <w:r>
+              <w:rPr>
+                <w:rFonts w:ascii="Consolas" w:cs="Consolas" w:eastAsia="Consolas" w:hAnsi="Consolas"/>
+                <w:color w:val="3B2F8F"/>
+                <w:sz w:val="18"/>
+                <w:szCs w:val="18"/>
+              </w:rPr>
+              <w:t xml:space="preserve">docs/questions-expert-comptable.md</w:t>
             </w:r>
           </w:p>
         </w:tc>
@@ -902,7 +920,7 @@
                 <w:sz w:val="18"/>
                 <w:szCs w:val="18"/>
               </w:rPr>
-              <w:t xml:space="preserve">Le serveur : ce qui est installé, ce que Rémi règle lui-même (sauvegardes, IA, Brevo, wallet).</w:t>
+              <w:t xml:space="preserve">Dossier de conformité du système de caisse ; questions fiscales encore ouvertes (NF525…).</w:t>
             </w:r>
           </w:p>
         </w:tc>
@@ -935,6 +953,65 @@
                 <w:sz w:val="18"/>
                 <w:szCs w:val="18"/>
               </w:rPr>
+              <w:t xml:space="preserve">docs/guide-serveur-test-ovh.md</w:t>
+            </w:r>
+          </w:p>
+        </w:tc>
+        <w:tc>
+          <w:tcPr>
+            <w:tcW w:type="dxa" w:w="4819"/>
+            <w:tcBorders>
+              <w:top w:val="single" w:color="D9D3F7" w:sz="4"/>
+              <w:left w:val="single" w:color="D9D3F7" w:sz="4"/>
+              <w:bottom w:val="single" w:color="D9D3F7" w:sz="4"/>
+              <w:right w:val="single" w:color="D9D3F7" w:sz="4"/>
+            </w:tcBorders>
+            <w:tcMar>
+              <w:top w:type="dxa" w:w="50"/>
+              <w:left w:type="dxa" w:w="90"/>
+              <w:bottom w:type="dxa" w:w="50"/>
+              <w:right w:type="dxa" w:w="90"/>
+            </w:tcMar>
+          </w:tcPr>
+          <w:p>
+            <w:r>
+              <w:rPr>
+                <w:sz w:val="18"/>
+                <w:szCs w:val="18"/>
+              </w:rPr>
+              <w:t xml:space="preserve">Le serveur : ce qui est installé, ce que Rémi règle lui-même (sauvegardes, IA, Brevo, wallet).</w:t>
+            </w:r>
+          </w:p>
+        </w:tc>
+      </w:tr>
+      <w:tr>
+        <w:trPr>
+          <w:tblHeader w:val="false"/>
+        </w:trPr>
+        <w:tc>
+          <w:tcPr>
+            <w:tcW w:type="dxa" w:w="4819"/>
+            <w:tcBorders>
+              <w:top w:val="single" w:color="D9D3F7" w:sz="4"/>
+              <w:left w:val="single" w:color="D9D3F7" w:sz="4"/>
+              <w:bottom w:val="single" w:color="D9D3F7" w:sz="4"/>
+              <w:right w:val="single" w:color="D9D3F7" w:sz="4"/>
+            </w:tcBorders>
+            <w:tcMar>
+              <w:top w:type="dxa" w:w="50"/>
+              <w:left w:type="dxa" w:w="90"/>
+              <w:bottom w:type="dxa" w:w="50"/>
+              <w:right w:type="dxa" w:w="90"/>
+            </w:tcMar>
+          </w:tcPr>
+          <w:p>
+            <w:r>
+              <w:rPr>
+                <w:rFonts w:ascii="Consolas" w:cs="Consolas" w:eastAsia="Consolas" w:hAnsi="Consolas"/>
+                <w:color w:val="3B2F8F"/>
+                <w:sz w:val="18"/>
+                <w:szCs w:val="18"/>
+              </w:rPr>
               <w:t xml:space="preserve">docs/audits/</w:t>
             </w:r>
           </w:p>
@@ -961,7 +1038,39 @@
                 <w:sz w:val="18"/>
                 <w:szCs w:val="18"/>
               </w:rPr>
-              <w:t xml:space="preserve">Audits de code (Claude, Codex) et leurs corrections.</w:t>
+              <w:t xml:space="preserve">Audits de code (Claude, Codex) et leurs corrections ; le dernier : </w:t>
+            </w:r>
+            <w:r>
+              <w:rPr>
+                <w:rFonts w:ascii="Consolas" w:cs="Consolas" w:eastAsia="Consolas" w:hAnsi="Consolas"/>
+                <w:color w:val="3B2F8F"/>
+                <w:sz w:val="18"/>
+                <w:szCs w:val="18"/>
+              </w:rPr>
+              <w:t xml:space="preserve">AUDIT_2026-10-25_claude-phases-67-75.md</w:t>
+            </w:r>
+            <w:r>
+              <w:rPr>
+                <w:sz w:val="18"/>
+                <w:szCs w:val="18"/>
+              </w:rPr>
+              <w:t xml:space="preserve">. Consigne pour Codex : </w:t>
+            </w:r>
+            <w:r>
+              <w:rPr>
+                <w:rFonts w:ascii="Consolas" w:cs="Consolas" w:eastAsia="Consolas" w:hAnsi="Consolas"/>
+                <w:color w:val="3B2F8F"/>
+                <w:sz w:val="18"/>
+                <w:szCs w:val="18"/>
+              </w:rPr>
+              <w:t xml:space="preserve">CODEX_AUDIT_PROMPT.md</w:t>
+            </w:r>
+            <w:r>
+              <w:rPr>
+                <w:sz w:val="18"/>
+                <w:szCs w:val="18"/>
+              </w:rPr>
+              <w:t xml:space="preserve">.</w:t>
             </w:r>
           </w:p>
         </w:tc>
@@ -1211,6 +1320,218 @@
     </w:p>
     <w:p>
       <w:pPr>
+        <w:pStyle w:val="ListParagraph"/>
+        <w:numPr>
+          <w:ilvl w:val="0"/>
+          <w:numId w:val="2"/>
+        </w:numPr>
+      </w:pPr>
+      <w:r>
+        <w:rPr>
+          <w:b/>
+          <w:bCs/>
+        </w:rPr>
+        <w:t xml:space="preserve">Tests des écrans d'un seul bloc</w:t>
+      </w:r>
+      <w:r>
+        <w:t xml:space="preserve"> : sur 6 Go, la suite tombe parfois (« Worker exited unexpectedly », code 134 ou 3221226505) : ce n'est pas un échec de test ; la lancer dossier par dossier (</w:t>
+      </w:r>
+      <w:r>
+        <w:rPr>
+          <w:rFonts w:ascii="Consolas" w:cs="Consolas" w:eastAsia="Consolas" w:hAnsi="Consolas"/>
+          <w:color w:val="3B2F8F"/>
+          <w:sz w:val="18"/>
+          <w:szCs w:val="18"/>
+        </w:rPr>
+        <w:t xml:space="preserve">cd apps/web &amp;&amp; ./node_modules/.bin/vitest run src/pages/resultats --pool=forks --maxWorkers=1</w:t>
+      </w:r>
+      <w:r>
+        <w:t xml:space="preserve">).</w:t>
+      </w:r>
+    </w:p>
+    <w:p>
+      <w:pPr>
+        <w:pStyle w:val="ListParagraph"/>
+        <w:numPr>
+          <w:ilvl w:val="0"/>
+          <w:numId w:val="2"/>
+        </w:numPr>
+      </w:pPr>
+      <w:r>
+        <w:rPr>
+          <w:b/>
+          <w:bCs/>
+        </w:rPr>
+        <w:t xml:space="preserve">Construction des écrans</w:t>
+      </w:r>
+      <w:r>
+        <w:t xml:space="preserve"> (</w:t>
+      </w:r>
+      <w:r>
+        <w:rPr>
+          <w:rFonts w:ascii="Consolas" w:cs="Consolas" w:eastAsia="Consolas" w:hAnsi="Consolas"/>
+          <w:color w:val="3B2F8F"/>
+          <w:sz w:val="18"/>
+          <w:szCs w:val="18"/>
+        </w:rPr>
+        <w:t xml:space="preserve">vite build</w:t>
+      </w:r>
+      <w:r>
+        <w:t xml:space="preserve">) qui échoue sur « memory allocation failed » : arrêter Docker le temps de la construction (</w:t>
+      </w:r>
+      <w:r>
+        <w:rPr>
+          <w:rFonts w:ascii="Consolas" w:cs="Consolas" w:eastAsia="Consolas" w:hAnsi="Consolas"/>
+          <w:color w:val="3B2F8F"/>
+          <w:sz w:val="18"/>
+          <w:szCs w:val="18"/>
+        </w:rPr>
+        <w:t xml:space="preserve">docker desktop stop</w:t>
+      </w:r>
+      <w:r>
+        <w:t xml:space="preserve">, puis </w:t>
+      </w:r>
+      <w:r>
+        <w:rPr>
+          <w:rFonts w:ascii="Consolas" w:cs="Consolas" w:eastAsia="Consolas" w:hAnsi="Consolas"/>
+          <w:color w:val="3B2F8F"/>
+          <w:sz w:val="18"/>
+          <w:szCs w:val="18"/>
+        </w:rPr>
+        <w:t xml:space="preserve">docker desktop start</w:t>
+      </w:r>
+      <w:r>
+        <w:t xml:space="preserve"> et </w:t>
+      </w:r>
+      <w:r>
+        <w:rPr>
+          <w:rFonts w:ascii="Consolas" w:cs="Consolas" w:eastAsia="Consolas" w:hAnsi="Consolas"/>
+          <w:color w:val="3B2F8F"/>
+          <w:sz w:val="18"/>
+          <w:szCs w:val="18"/>
+        </w:rPr>
+        <w:t xml:space="preserve">pnpm db:up</w:t>
+      </w:r>
+      <w:r>
+        <w:t xml:space="preserve">).</w:t>
+      </w:r>
+    </w:p>
+    <w:p>
+      <w:pPr>
+        <w:pStyle w:val="ListParagraph"/>
+        <w:numPr>
+          <w:ilvl w:val="0"/>
+          <w:numId w:val="2"/>
+        </w:numPr>
+      </w:pPr>
+      <w:r>
+        <w:rPr>
+          <w:rFonts w:ascii="Consolas" w:cs="Consolas" w:eastAsia="Consolas" w:hAnsi="Consolas"/>
+          <w:b/>
+          <w:bCs/>
+          <w:color w:val="3B2F8F"/>
+          <w:sz w:val="18"/>
+          <w:szCs w:val="18"/>
+        </w:rPr>
+        <w:t xml:space="preserve">tsx</w:t>
+      </w:r>
+      <w:r>
+        <w:rPr>
+          <w:b/>
+          <w:bCs/>
+        </w:rPr>
+        <w:t xml:space="preserve"> qui échoue au démarrage</w:t>
+      </w:r>
+      <w:r>
+        <w:t xml:space="preserve"> (« spawn UNKNOWN », vu le 2026-10-25 sur le poste de Rémi, sans doute l'antivirus) : lancer le serveur par </w:t>
+      </w:r>
+      <w:r>
+        <w:rPr>
+          <w:rFonts w:ascii="Consolas" w:cs="Consolas" w:eastAsia="Consolas" w:hAnsi="Consolas"/>
+          <w:color w:val="3B2F8F"/>
+          <w:sz w:val="18"/>
+          <w:szCs w:val="18"/>
+        </w:rPr>
+        <w:t xml:space="preserve">node --import tsx src/index.ts</w:t>
+      </w:r>
+      <w:r>
+        <w:t xml:space="preserve"> depuis </w:t>
+      </w:r>
+      <w:r>
+        <w:rPr>
+          <w:rFonts w:ascii="Consolas" w:cs="Consolas" w:eastAsia="Consolas" w:hAnsi="Consolas"/>
+          <w:color w:val="3B2F8F"/>
+          <w:sz w:val="18"/>
+          <w:szCs w:val="18"/>
+        </w:rPr>
+        <w:t xml:space="preserve">apps/api</w:t>
+      </w:r>
+      <w:r>
+        <w:t xml:space="preserve"> ; la configuration d'aperçu </w:t>
+      </w:r>
+      <w:r>
+        <w:rPr>
+          <w:rFonts w:ascii="Consolas" w:cs="Consolas" w:eastAsia="Consolas" w:hAnsi="Consolas"/>
+          <w:color w:val="3B2F8F"/>
+          <w:sz w:val="18"/>
+          <w:szCs w:val="18"/>
+        </w:rPr>
+        <w:t xml:space="preserve">flaix-expert-leger</w:t>
+      </w:r>
+      <w:r>
+        <w:t xml:space="preserve"> (</w:t>
+      </w:r>
+      <w:r>
+        <w:rPr>
+          <w:rFonts w:ascii="Consolas" w:cs="Consolas" w:eastAsia="Consolas" w:hAnsi="Consolas"/>
+          <w:color w:val="3B2F8F"/>
+          <w:sz w:val="18"/>
+          <w:szCs w:val="18"/>
+        </w:rPr>
+        <w:t xml:space="preserve">.claude/launch.json</w:t>
+      </w:r>
+      <w:r>
+        <w:t xml:space="preserve"> du dossier de travail, hors dépôt) le fait déjà. Si </w:t>
+      </w:r>
+      <w:r>
+        <w:rPr>
+          <w:rFonts w:ascii="Consolas" w:cs="Consolas" w:eastAsia="Consolas" w:hAnsi="Consolas"/>
+          <w:color w:val="3B2F8F"/>
+          <w:sz w:val="18"/>
+          <w:szCs w:val="18"/>
+        </w:rPr>
+        <w:t xml:space="preserve">npx</w:t>
+      </w:r>
+      <w:r>
+        <w:t xml:space="preserve"> lui-même échoue (« Cannot find module './lt' »), passer par </w:t>
+      </w:r>
+      <w:r>
+        <w:rPr>
+          <w:rFonts w:ascii="Consolas" w:cs="Consolas" w:eastAsia="Consolas" w:hAnsi="Consolas"/>
+          <w:color w:val="3B2F8F"/>
+          <w:sz w:val="18"/>
+          <w:szCs w:val="18"/>
+        </w:rPr>
+        <w:t xml:space="preserve">pnpm exec …</w:t>
+      </w:r>
+      <w:r>
+        <w:t xml:space="preserve"> ou </w:t>
+      </w:r>
+      <w:r>
+        <w:rPr>
+          <w:rFonts w:ascii="Consolas" w:cs="Consolas" w:eastAsia="Consolas" w:hAnsi="Consolas"/>
+          <w:color w:val="3B2F8F"/>
+          <w:sz w:val="18"/>
+          <w:szCs w:val="18"/>
+        </w:rPr>
+        <w:t xml:space="preserve">./node_modules/.bin/…</w:t>
+      </w:r>
+      <w:r>
+        <w:t xml:space="preserve">.</w:t>
+      </w:r>
+    </w:p>
+    <w:p>
+      <w:pPr>
         <w:pStyle w:val="Heading2"/>
       </w:pPr>
       <w:r>
@@ -1491,7 +1812,29 @@
         <w:t xml:space="preserve">synchroniser_complements_formation</w:t>
       </w:r>
       <w:r>
-        <w:t xml:space="preserve"> (reprendre la dernière version et ajouter la copie), et les routes de configuration figurent dans la liste </w:t>
+        <w:t xml:space="preserve"> (reprendre la </w:t>
+      </w:r>
+      <w:r>
+        <w:rPr>
+          <w:b/>
+          <w:bCs/>
+        </w:rPr>
+        <w:t xml:space="preserve">dernière</w:t>
+      </w:r>
+      <w:r>
+        <w:t xml:space="preserve"> version — aujourd'hui </w:t>
+      </w:r>
+      <w:r>
+        <w:rPr>
+          <w:rFonts w:ascii="Consolas" w:cs="Consolas" w:eastAsia="Consolas" w:hAnsi="Consolas"/>
+          <w:color w:val="3B2F8F"/>
+          <w:sz w:val="18"/>
+          <w:szCs w:val="18"/>
+        </w:rPr>
+        <w:t xml:space="preserve">0058_formation_famille_correspondances.sql</w:t>
+      </w:r>
+      <w:r>
+        <w:t xml:space="preserve"> — et ajouter la copie), et les routes de configuration figurent dans la liste </w:t>
       </w:r>
       <w:r>
         <w:rPr>
@@ -1515,7 +1858,28 @@
         <w:t xml:space="preserve">apps/api/src/serveur.ts</w:t>
       </w:r>
       <w:r>
-        <w:t xml:space="preserve"> (lecture seule en formation).</w:t>
+        <w:t xml:space="preserve"> (lecture seule en formation). Cette règle a été oubliée deux fois (§15.171, §15.173) et rattrapée par l'audit du 2026-10-25 : </w:t>
+      </w:r>
+      <w:r>
+        <w:rPr>
+          <w:b/>
+          <w:bCs/>
+        </w:rPr>
+        <w:t xml:space="preserve">ajouter un test dans </w:t>
+      </w:r>
+      <w:r>
+        <w:rPr>
+          <w:rFonts w:ascii="Consolas" w:cs="Consolas" w:eastAsia="Consolas" w:hAnsi="Consolas"/>
+          <w:b/>
+          <w:bCs/>
+          <w:color w:val="3B2F8F"/>
+          <w:sz w:val="18"/>
+          <w:szCs w:val="18"/>
+        </w:rPr>
+        <w:t xml:space="preserve">apps/api/test/formation-complements.test.ts</w:t>
+      </w:r>
+      <w:r>
+        <w:t xml:space="preserve"> pour chaque nouvelle configuration.</w:t>
       </w:r>
     </w:p>
     <w:p>
@@ -2107,6 +2471,1987 @@
         <w:pStyle w:val="Heading2"/>
       </w:pPr>
       <w:r>
+        <w:t xml:space="preserve">6 bis. Ce qui a été construit depuis la phase 66 (2026-10-19 → 2026-10-25)</w:t>
+      </w:r>
+    </w:p>
+    <w:p>
+      <w:r>
+        <w:t xml:space="preserve">Le détail est dans le dossier projet (§15.166 → §15.175), une fiche par phase dans </w:t>
+      </w:r>
+      <w:r>
+        <w:rPr>
+          <w:rFonts w:ascii="Consolas" w:cs="Consolas" w:eastAsia="Consolas" w:hAnsi="Consolas"/>
+          <w:color w:val="3B2F8F"/>
+          <w:sz w:val="18"/>
+          <w:szCs w:val="18"/>
+        </w:rPr>
+        <w:t xml:space="preserve">phases/</w:t>
+      </w:r>
+      <w:r>
+        <w:t xml:space="preserve"> et l'audit </w:t>
+      </w:r>
+      <w:r>
+        <w:rPr>
+          <w:rFonts w:ascii="Consolas" w:cs="Consolas" w:eastAsia="Consolas" w:hAnsi="Consolas"/>
+          <w:color w:val="3B2F8F"/>
+          <w:sz w:val="18"/>
+          <w:szCs w:val="18"/>
+        </w:rPr>
+        <w:t xml:space="preserve">AUDIT_2026-10-25_claude-phases-67-75.md</w:t>
+      </w:r>
+      <w:r>
+        <w:t xml:space="preserve">. En résumé, par écran :</w:t>
+      </w:r>
+    </w:p>
+    <w:tbl>
+      <w:tblPr>
+        <w:tblW w:type="dxa" w:w="9638"/>
+        <w:tblBorders>
+          <w:top w:val="single" w:color="auto" w:sz="4"/>
+          <w:left w:val="single" w:color="auto" w:sz="4"/>
+          <w:bottom w:val="single" w:color="auto" w:sz="4"/>
+          <w:right w:val="single" w:color="auto" w:sz="4"/>
+          <w:insideH w:val="single" w:color="auto" w:sz="4"/>
+          <w:insideV w:val="single" w:color="auto" w:sz="4"/>
+        </w:tblBorders>
+      </w:tblPr>
+      <w:tblGrid>
+        <w:gridCol w:w="3212"/>
+        <w:gridCol w:w="3212"/>
+        <w:gridCol w:w="3214"/>
+      </w:tblGrid>
+      <w:tr>
+        <w:trPr>
+          <w:tblHeader/>
+        </w:trPr>
+        <w:tc>
+          <w:tcPr>
+            <w:tcW w:type="dxa" w:w="3212"/>
+            <w:tcBorders>
+              <w:top w:val="single" w:color="D9D3F7" w:sz="4"/>
+              <w:left w:val="single" w:color="D9D3F7" w:sz="4"/>
+              <w:bottom w:val="single" w:color="D9D3F7" w:sz="4"/>
+              <w:right w:val="single" w:color="D9D3F7" w:sz="4"/>
+            </w:tcBorders>
+            <w:shd w:fill="EFEAFE" w:color="auto" w:val="clear"/>
+            <w:tcMar>
+              <w:top w:type="dxa" w:w="50"/>
+              <w:left w:type="dxa" w:w="90"/>
+              <w:bottom w:type="dxa" w:w="50"/>
+              <w:right w:type="dxa" w:w="90"/>
+            </w:tcMar>
+          </w:tcPr>
+          <w:p>
+            <w:r>
+              <w:rPr>
+                <w:b/>
+                <w:bCs/>
+                <w:sz w:val="18"/>
+                <w:szCs w:val="18"/>
+              </w:rPr>
+              <w:t xml:space="preserve">Écran (menu)</w:t>
+            </w:r>
+          </w:p>
+        </w:tc>
+        <w:tc>
+          <w:tcPr>
+            <w:tcW w:type="dxa" w:w="3212"/>
+            <w:tcBorders>
+              <w:top w:val="single" w:color="D9D3F7" w:sz="4"/>
+              <w:left w:val="single" w:color="D9D3F7" w:sz="4"/>
+              <w:bottom w:val="single" w:color="D9D3F7" w:sz="4"/>
+              <w:right w:val="single" w:color="D9D3F7" w:sz="4"/>
+            </w:tcBorders>
+            <w:shd w:fill="EFEAFE" w:color="auto" w:val="clear"/>
+            <w:tcMar>
+              <w:top w:type="dxa" w:w="50"/>
+              <w:left w:type="dxa" w:w="90"/>
+              <w:bottom w:type="dxa" w:w="50"/>
+              <w:right w:type="dxa" w:w="90"/>
+            </w:tcMar>
+          </w:tcPr>
+          <w:p>
+            <w:r>
+              <w:rPr>
+                <w:b/>
+                <w:bCs/>
+                <w:sz w:val="18"/>
+                <w:szCs w:val="18"/>
+              </w:rPr>
+              <w:t xml:space="preserve">Ce qu'il fait</w:t>
+            </w:r>
+          </w:p>
+        </w:tc>
+        <w:tc>
+          <w:tcPr>
+            <w:tcW w:type="dxa" w:w="3214"/>
+            <w:tcBorders>
+              <w:top w:val="single" w:color="D9D3F7" w:sz="4"/>
+              <w:left w:val="single" w:color="D9D3F7" w:sz="4"/>
+              <w:bottom w:val="single" w:color="D9D3F7" w:sz="4"/>
+              <w:right w:val="single" w:color="D9D3F7" w:sz="4"/>
+            </w:tcBorders>
+            <w:shd w:fill="EFEAFE" w:color="auto" w:val="clear"/>
+            <w:tcMar>
+              <w:top w:type="dxa" w:w="50"/>
+              <w:left w:type="dxa" w:w="90"/>
+              <w:bottom w:type="dxa" w:w="50"/>
+              <w:right w:type="dxa" w:w="90"/>
+            </w:tcMar>
+          </w:tcPr>
+          <w:p>
+            <w:r>
+              <w:rPr>
+                <w:b/>
+                <w:bCs/>
+                <w:sz w:val="18"/>
+                <w:szCs w:val="18"/>
+              </w:rPr>
+              <w:t xml:space="preserve">Code principal</w:t>
+            </w:r>
+          </w:p>
+        </w:tc>
+      </w:tr>
+      <w:tr>
+        <w:trPr>
+          <w:tblHeader w:val="false"/>
+        </w:trPr>
+        <w:tc>
+          <w:tcPr>
+            <w:tcW w:type="dxa" w:w="3212"/>
+            <w:tcBorders>
+              <w:top w:val="single" w:color="D9D3F7" w:sz="4"/>
+              <w:left w:val="single" w:color="D9D3F7" w:sz="4"/>
+              <w:bottom w:val="single" w:color="D9D3F7" w:sz="4"/>
+              <w:right w:val="single" w:color="D9D3F7" w:sz="4"/>
+            </w:tcBorders>
+            <w:tcMar>
+              <w:top w:type="dxa" w:w="50"/>
+              <w:left w:type="dxa" w:w="90"/>
+              <w:bottom w:type="dxa" w:w="50"/>
+              <w:right w:type="dxa" w:w="90"/>
+            </w:tcMar>
+          </w:tcPr>
+          <w:p>
+            <w:r>
+              <w:rPr>
+                <w:b/>
+                <w:bCs/>
+                <w:sz w:val="18"/>
+                <w:szCs w:val="18"/>
+              </w:rPr>
+              <w:t xml:space="preserve">En direct</w:t>
+            </w:r>
+            <w:r>
+              <w:rPr>
+                <w:sz w:val="18"/>
+                <w:szCs w:val="18"/>
+              </w:rPr>
+              <w:t xml:space="preserve"> (phases 67, 68, 70, 71)</w:t>
+            </w:r>
+          </w:p>
+        </w:tc>
+        <w:tc>
+          <w:tcPr>
+            <w:tcW w:type="dxa" w:w="3212"/>
+            <w:tcBorders>
+              <w:top w:val="single" w:color="D9D3F7" w:sz="4"/>
+              <w:left w:val="single" w:color="D9D3F7" w:sz="4"/>
+              <w:bottom w:val="single" w:color="D9D3F7" w:sz="4"/>
+              <w:right w:val="single" w:color="D9D3F7" w:sz="4"/>
+            </w:tcBorders>
+            <w:tcMar>
+              <w:top w:type="dxa" w:w="50"/>
+              <w:left w:type="dxa" w:w="90"/>
+              <w:bottom w:type="dxa" w:w="50"/>
+              <w:right w:type="dxa" w:w="90"/>
+            </w:tcMar>
+          </w:tcPr>
+          <w:p>
+            <w:r>
+              <w:rPr>
+                <w:sz w:val="18"/>
+                <w:szCs w:val="18"/>
+              </w:rPr>
+              <w:t xml:space="preserve">La soirée en cours : 8 chiffres comparés au match précédent au même moment, le lieu en 3D (petits chiffres sous chaque stand, détail au clic), courbe par quart d'heure, catégories, cartes des stands ; « Ce qu'il te reste » à la minute ; « Ouvrir l'événement » hors soirée ; raccourci « Clôturer la soirée ».</w:t>
+            </w:r>
+          </w:p>
+        </w:tc>
+        <w:tc>
+          <w:tcPr>
+            <w:tcW w:type="dxa" w:w="3214"/>
+            <w:tcBorders>
+              <w:top w:val="single" w:color="D9D3F7" w:sz="4"/>
+              <w:left w:val="single" w:color="D9D3F7" w:sz="4"/>
+              <w:bottom w:val="single" w:color="D9D3F7" w:sz="4"/>
+              <w:right w:val="single" w:color="D9D3F7" w:sz="4"/>
+            </w:tcBorders>
+            <w:tcMar>
+              <w:top w:type="dxa" w:w="50"/>
+              <w:left w:type="dxa" w:w="90"/>
+              <w:bottom w:type="dxa" w:w="50"/>
+              <w:right w:type="dxa" w:w="90"/>
+            </w:tcMar>
+          </w:tcPr>
+          <w:p>
+            <w:r>
+              <w:rPr>
+                <w:rFonts w:ascii="Consolas" w:cs="Consolas" w:eastAsia="Consolas" w:hAnsi="Consolas"/>
+                <w:color w:val="3B2F8F"/>
+                <w:sz w:val="18"/>
+                <w:szCs w:val="18"/>
+              </w:rPr>
+              <w:t xml:space="preserve">packages/domain/src/direct.ts</w:t>
+            </w:r>
+            <w:r>
+              <w:rPr>
+                <w:sz w:val="18"/>
+                <w:szCs w:val="18"/>
+              </w:rPr>
+              <w:t xml:space="preserve"> (</w:t>
+            </w:r>
+            <w:r>
+              <w:rPr>
+                <w:rFonts w:ascii="Consolas" w:cs="Consolas" w:eastAsia="Consolas" w:hAnsi="Consolas"/>
+                <w:color w:val="3B2F8F"/>
+                <w:sz w:val="18"/>
+                <w:szCs w:val="18"/>
+              </w:rPr>
+              <w:t xml:space="preserve">tableauDirect</w:t>
+            </w:r>
+            <w:r>
+              <w:rPr>
+                <w:sz w:val="18"/>
+                <w:szCs w:val="18"/>
+              </w:rPr>
+              <w:t xml:space="preserve">), </w:t>
+            </w:r>
+            <w:r>
+              <w:rPr>
+                <w:rFonts w:ascii="Consolas" w:cs="Consolas" w:eastAsia="Consolas" w:hAnsi="Consolas"/>
+                <w:color w:val="3B2F8F"/>
+                <w:sz w:val="18"/>
+                <w:szCs w:val="18"/>
+              </w:rPr>
+              <w:t xml:space="preserve">apps/api/src/routes/direct.ts</w:t>
+            </w:r>
+            <w:r>
+              <w:rPr>
+                <w:sz w:val="18"/>
+                <w:szCs w:val="18"/>
+              </w:rPr>
+              <w:t xml:space="preserve">, </w:t>
+            </w:r>
+            <w:r>
+              <w:rPr>
+                <w:rFonts w:ascii="Consolas" w:cs="Consolas" w:eastAsia="Consolas" w:hAnsi="Consolas"/>
+                <w:color w:val="3B2F8F"/>
+                <w:sz w:val="18"/>
+                <w:szCs w:val="18"/>
+              </w:rPr>
+              <w:t xml:space="preserve">apps/web/src/pages/direct/EnDirect.tsx</w:t>
+            </w:r>
+            <w:r>
+              <w:rPr>
+                <w:sz w:val="18"/>
+                <w:szCs w:val="18"/>
+              </w:rPr>
+              <w:t xml:space="preserve">, </w:t>
+            </w:r>
+            <w:r>
+              <w:rPr>
+                <w:rFonts w:ascii="Consolas" w:cs="Consolas" w:eastAsia="Consolas" w:hAnsi="Consolas"/>
+                <w:color w:val="3B2F8F"/>
+                <w:sz w:val="18"/>
+                <w:szCs w:val="18"/>
+              </w:rPr>
+              <w:t xml:space="preserve">pages/resultats/PlanStade.tsx</w:t>
+            </w:r>
+            <w:r>
+              <w:rPr>
+                <w:sz w:val="18"/>
+                <w:szCs w:val="18"/>
+              </w:rPr>
+              <w:t xml:space="preserve">, </w:t>
+            </w:r>
+            <w:r>
+              <w:rPr>
+                <w:rFonts w:ascii="Consolas" w:cs="Consolas" w:eastAsia="Consolas" w:hAnsi="Consolas"/>
+                <w:color w:val="3B2F8F"/>
+                <w:sz w:val="18"/>
+                <w:szCs w:val="18"/>
+              </w:rPr>
+              <w:t xml:space="preserve">Stade3D.tsx</w:t>
+            </w:r>
+          </w:p>
+        </w:tc>
+      </w:tr>
+      <w:tr>
+        <w:trPr>
+          <w:tblHeader w:val="false"/>
+        </w:trPr>
+        <w:tc>
+          <w:tcPr>
+            <w:tcW w:type="dxa" w:w="3212"/>
+            <w:tcBorders>
+              <w:top w:val="single" w:color="D9D3F7" w:sz="4"/>
+              <w:left w:val="single" w:color="D9D3F7" w:sz="4"/>
+              <w:bottom w:val="single" w:color="D9D3F7" w:sz="4"/>
+              <w:right w:val="single" w:color="D9D3F7" w:sz="4"/>
+            </w:tcBorders>
+            <w:tcMar>
+              <w:top w:type="dxa" w:w="50"/>
+              <w:left w:type="dxa" w:w="90"/>
+              <w:bottom w:type="dxa" w:w="50"/>
+              <w:right w:type="dxa" w:w="90"/>
+            </w:tcMar>
+          </w:tcPr>
+          <w:p>
+            <w:r>
+              <w:rPr>
+                <w:b/>
+                <w:bCs/>
+                <w:sz w:val="18"/>
+                <w:szCs w:val="18"/>
+              </w:rPr>
+              <w:t xml:space="preserve">Résultats</w:t>
+            </w:r>
+            <w:r>
+              <w:rPr>
+                <w:sz w:val="18"/>
+                <w:szCs w:val="18"/>
+              </w:rPr>
+              <w:t xml:space="preserve"> (68, 70, 71, 72, 75)</w:t>
+            </w:r>
+          </w:p>
+        </w:tc>
+        <w:tc>
+          <w:tcPr>
+            <w:tcW w:type="dxa" w:w="3212"/>
+            <w:tcBorders>
+              <w:top w:val="single" w:color="D9D3F7" w:sz="4"/>
+              <w:left w:val="single" w:color="D9D3F7" w:sz="4"/>
+              <w:bottom w:val="single" w:color="D9D3F7" w:sz="4"/>
+              <w:right w:val="single" w:color="D9D3F7" w:sz="4"/>
+            </w:tcBorders>
+            <w:tcMar>
+              <w:top w:type="dxa" w:w="50"/>
+              <w:left w:type="dxa" w:w="90"/>
+              <w:bottom w:type="dxa" w:w="50"/>
+              <w:right w:type="dxa" w:w="90"/>
+            </w:tcMar>
+          </w:tcPr>
+          <w:p>
+            <w:r>
+              <w:rPr>
+                <w:sz w:val="18"/>
+                <w:szCs w:val="18"/>
+              </w:rPr>
+              <w:t xml:space="preserve">Événements </w:t>
+            </w:r>
+            <w:r>
+              <w:rPr>
+                <w:b/>
+                <w:bCs/>
+                <w:sz w:val="18"/>
+                <w:szCs w:val="18"/>
+              </w:rPr>
+              <w:t xml:space="preserve">terminés</w:t>
+            </w:r>
+            <w:r>
+              <w:rPr>
+                <w:sz w:val="18"/>
+                <w:szCs w:val="18"/>
+              </w:rPr>
+              <w:t xml:space="preserve"> seulement (</w:t>
+            </w:r>
+            <w:r>
+              <w:rPr>
+                <w:rFonts w:ascii="Consolas" w:cs="Consolas" w:eastAsia="Consolas" w:hAnsi="Consolas"/>
+                <w:color w:val="3B2F8F"/>
+                <w:sz w:val="18"/>
+                <w:szCs w:val="18"/>
+              </w:rPr>
+              <w:t xml:space="preserve">evenementTermine</w:t>
+            </w:r>
+            <w:r>
+              <w:rPr>
+                <w:sz w:val="18"/>
+                <w:szCs w:val="18"/>
+              </w:rPr>
+              <w:t xml:space="preserve"> : clos, ou — caisse connectée — commencé et avec des ventes). Vue d'ensemble au design de la 2e maquette : « Bonsoir Rémi », « Ce qu'il te reste » en clair, 4 chiffres, courbe et catégories, ce qui se vend le mieux, à surveiller, prochain match (prévision), « Les chiffres de la soirée » (conversion, articles par ticket, moment fort, personnel, pertes, ruptures, abonnés, boissons / nourriture, Click &amp; Collect). Onglets Marges (marge par catégorie) et Événements privés.</w:t>
+            </w:r>
+          </w:p>
+        </w:tc>
+        <w:tc>
+          <w:tcPr>
+            <w:tcW w:type="dxa" w:w="3214"/>
+            <w:tcBorders>
+              <w:top w:val="single" w:color="D9D3F7" w:sz="4"/>
+              <w:left w:val="single" w:color="D9D3F7" w:sz="4"/>
+              <w:bottom w:val="single" w:color="D9D3F7" w:sz="4"/>
+              <w:right w:val="single" w:color="D9D3F7" w:sz="4"/>
+            </w:tcBorders>
+            <w:tcMar>
+              <w:top w:type="dxa" w:w="50"/>
+              <w:left w:type="dxa" w:w="90"/>
+              <w:bottom w:type="dxa" w:w="50"/>
+              <w:right w:type="dxa" w:w="90"/>
+            </w:tcMar>
+          </w:tcPr>
+          <w:p>
+            <w:r>
+              <w:rPr>
+                <w:rFonts w:ascii="Consolas" w:cs="Consolas" w:eastAsia="Consolas" w:hAnsi="Consolas"/>
+                <w:color w:val="3B2F8F"/>
+                <w:sz w:val="18"/>
+                <w:szCs w:val="18"/>
+              </w:rPr>
+              <w:t xml:space="preserve">pages/Resultats.tsx</w:t>
+            </w:r>
+            <w:r>
+              <w:rPr>
+                <w:sz w:val="18"/>
+                <w:szCs w:val="18"/>
+              </w:rPr>
+              <w:t xml:space="preserve">, </w:t>
+            </w:r>
+            <w:r>
+              <w:rPr>
+                <w:rFonts w:ascii="Consolas" w:cs="Consolas" w:eastAsia="Consolas" w:hAnsi="Consolas"/>
+                <w:color w:val="3B2F8F"/>
+                <w:sz w:val="18"/>
+                <w:szCs w:val="18"/>
+              </w:rPr>
+              <w:t xml:space="preserve">pages/resultats/Tableaux.tsx</w:t>
+            </w:r>
+            <w:r>
+              <w:rPr>
+                <w:sz w:val="18"/>
+                <w:szCs w:val="18"/>
+              </w:rPr>
+              <w:t xml:space="preserve">, </w:t>
+            </w:r>
+            <w:r>
+              <w:rPr>
+                <w:rFonts w:ascii="Consolas" w:cs="Consolas" w:eastAsia="Consolas" w:hAnsi="Consolas"/>
+                <w:color w:val="3B2F8F"/>
+                <w:sz w:val="18"/>
+                <w:szCs w:val="18"/>
+              </w:rPr>
+              <w:t xml:space="preserve">Ensemble.tsx</w:t>
+            </w:r>
+            <w:r>
+              <w:rPr>
+                <w:sz w:val="18"/>
+                <w:szCs w:val="18"/>
+              </w:rPr>
+              <w:t xml:space="preserve">, </w:t>
+            </w:r>
+            <w:r>
+              <w:rPr>
+                <w:rFonts w:ascii="Consolas" w:cs="Consolas" w:eastAsia="Consolas" w:hAnsi="Consolas"/>
+                <w:color w:val="3B2F8F"/>
+                <w:sz w:val="18"/>
+                <w:szCs w:val="18"/>
+              </w:rPr>
+              <w:t xml:space="preserve">ResteSoiree.tsx</w:t>
+            </w:r>
+            <w:r>
+              <w:rPr>
+                <w:sz w:val="18"/>
+                <w:szCs w:val="18"/>
+              </w:rPr>
+              <w:t xml:space="preserve">, </w:t>
+            </w:r>
+            <w:r>
+              <w:rPr>
+                <w:rFonts w:ascii="Consolas" w:cs="Consolas" w:eastAsia="Consolas" w:hAnsi="Consolas"/>
+                <w:color w:val="3B2F8F"/>
+                <w:sz w:val="18"/>
+                <w:szCs w:val="18"/>
+              </w:rPr>
+              <w:t xml:space="preserve">ChiffresSoiree.tsx</w:t>
+            </w:r>
+            <w:r>
+              <w:rPr>
+                <w:sz w:val="18"/>
+                <w:szCs w:val="18"/>
+              </w:rPr>
+              <w:t xml:space="preserve">, </w:t>
+            </w:r>
+            <w:r>
+              <w:rPr>
+                <w:rFonts w:ascii="Consolas" w:cs="Consolas" w:eastAsia="Consolas" w:hAnsi="Consolas"/>
+                <w:color w:val="3B2F8F"/>
+                <w:sz w:val="18"/>
+                <w:szCs w:val="18"/>
+              </w:rPr>
+              <w:t xml:space="preserve">Prives.tsx</w:t>
+            </w:r>
+            <w:r>
+              <w:rPr>
+                <w:sz w:val="18"/>
+                <w:szCs w:val="18"/>
+              </w:rPr>
+              <w:t xml:space="preserve"> ; </w:t>
+            </w:r>
+            <w:r>
+              <w:rPr>
+                <w:rFonts w:ascii="Consolas" w:cs="Consolas" w:eastAsia="Consolas" w:hAnsi="Consolas"/>
+                <w:color w:val="3B2F8F"/>
+                <w:sz w:val="18"/>
+                <w:szCs w:val="18"/>
+              </w:rPr>
+              <w:t xml:space="preserve">packages/domain/src/chiffres-soiree.ts</w:t>
+            </w:r>
+            <w:r>
+              <w:rPr>
+                <w:sz w:val="18"/>
+                <w:szCs w:val="18"/>
+              </w:rPr>
+              <w:t xml:space="preserve"> ; </w:t>
+            </w:r>
+            <w:r>
+              <w:rPr>
+                <w:rFonts w:ascii="Consolas" w:cs="Consolas" w:eastAsia="Consolas" w:hAnsi="Consolas"/>
+                <w:color w:val="3B2F8F"/>
+                <w:sz w:val="18"/>
+                <w:szCs w:val="18"/>
+              </w:rPr>
+              <w:t xml:space="preserve">apps/api/src/routes/resultats.ts</w:t>
+            </w:r>
+            <w:r>
+              <w:rPr>
+                <w:sz w:val="18"/>
+                <w:szCs w:val="18"/>
+              </w:rPr>
+              <w:t xml:space="preserve"> (</w:t>
+            </w:r>
+            <w:r>
+              <w:rPr>
+                <w:rFonts w:ascii="Consolas" w:cs="Consolas" w:eastAsia="Consolas" w:hAnsi="Consolas"/>
+                <w:color w:val="3B2F8F"/>
+                <w:sz w:val="18"/>
+                <w:szCs w:val="18"/>
+              </w:rPr>
+              <w:t xml:space="preserve">chiffresDeSoiree</w:t>
+            </w:r>
+            <w:r>
+              <w:rPr>
+                <w:sz w:val="18"/>
+                <w:szCs w:val="18"/>
+              </w:rPr>
+              <w:t xml:space="preserve">)</w:t>
+            </w:r>
+          </w:p>
+        </w:tc>
+      </w:tr>
+      <w:tr>
+        <w:trPr>
+          <w:tblHeader w:val="false"/>
+        </w:trPr>
+        <w:tc>
+          <w:tcPr>
+            <w:tcW w:type="dxa" w:w="3212"/>
+            <w:tcBorders>
+              <w:top w:val="single" w:color="D9D3F7" w:sz="4"/>
+              <w:left w:val="single" w:color="D9D3F7" w:sz="4"/>
+              <w:bottom w:val="single" w:color="D9D3F7" w:sz="4"/>
+              <w:right w:val="single" w:color="D9D3F7" w:sz="4"/>
+            </w:tcBorders>
+            <w:tcMar>
+              <w:top w:type="dxa" w:w="50"/>
+              <w:left w:type="dxa" w:w="90"/>
+              <w:bottom w:type="dxa" w:w="50"/>
+              <w:right w:type="dxa" w:w="90"/>
+            </w:tcMar>
+          </w:tcPr>
+          <w:p>
+            <w:r>
+              <w:rPr>
+                <w:b/>
+                <w:bCs/>
+                <w:sz w:val="18"/>
+                <w:szCs w:val="18"/>
+              </w:rPr>
+              <w:t xml:space="preserve">Stock</w:t>
+            </w:r>
+            <w:r>
+              <w:rPr>
+                <w:sz w:val="18"/>
+                <w:szCs w:val="18"/>
+              </w:rPr>
+              <w:t xml:space="preserve"> (70, 73)</w:t>
+            </w:r>
+          </w:p>
+        </w:tc>
+        <w:tc>
+          <w:tcPr>
+            <w:tcW w:type="dxa" w:w="3212"/>
+            <w:tcBorders>
+              <w:top w:val="single" w:color="D9D3F7" w:sz="4"/>
+              <w:left w:val="single" w:color="D9D3F7" w:sz="4"/>
+              <w:bottom w:val="single" w:color="D9D3F7" w:sz="4"/>
+              <w:right w:val="single" w:color="D9D3F7" w:sz="4"/>
+            </w:tcBorders>
+            <w:tcMar>
+              <w:top w:type="dxa" w:w="50"/>
+              <w:left w:type="dxa" w:w="90"/>
+              <w:bottom w:type="dxa" w:w="50"/>
+              <w:right w:type="dxa" w:w="90"/>
+            </w:tcMar>
+          </w:tcPr>
+          <w:p>
+            <w:r>
+              <w:rPr>
+                <w:sz w:val="18"/>
+                <w:szCs w:val="18"/>
+              </w:rPr>
+              <w:t xml:space="preserve">Produits seuls, en 4 étapes : 1. Réserve centrale, 2. Mise en place, 3. Pendant l'événement, 4. Comptage.</w:t>
+            </w:r>
+          </w:p>
+        </w:tc>
+        <w:tc>
+          <w:tcPr>
+            <w:tcW w:type="dxa" w:w="3214"/>
+            <w:tcBorders>
+              <w:top w:val="single" w:color="D9D3F7" w:sz="4"/>
+              <w:left w:val="single" w:color="D9D3F7" w:sz="4"/>
+              <w:bottom w:val="single" w:color="D9D3F7" w:sz="4"/>
+              <w:right w:val="single" w:color="D9D3F7" w:sz="4"/>
+            </w:tcBorders>
+            <w:tcMar>
+              <w:top w:type="dxa" w:w="50"/>
+              <w:left w:type="dxa" w:w="90"/>
+              <w:bottom w:type="dxa" w:w="50"/>
+              <w:right w:type="dxa" w:w="90"/>
+            </w:tcMar>
+          </w:tcPr>
+          <w:p>
+            <w:r>
+              <w:rPr>
+                <w:rFonts w:ascii="Consolas" w:cs="Consolas" w:eastAsia="Consolas" w:hAnsi="Consolas"/>
+                <w:color w:val="3B2F8F"/>
+                <w:sz w:val="18"/>
+                <w:szCs w:val="18"/>
+              </w:rPr>
+              <w:t xml:space="preserve">pages/stock/Stock.tsx</w:t>
+            </w:r>
+          </w:p>
+        </w:tc>
+      </w:tr>
+      <w:tr>
+        <w:trPr>
+          <w:tblHeader w:val="false"/>
+        </w:trPr>
+        <w:tc>
+          <w:tcPr>
+            <w:tcW w:type="dxa" w:w="3212"/>
+            <w:tcBorders>
+              <w:top w:val="single" w:color="D9D3F7" w:sz="4"/>
+              <w:left w:val="single" w:color="D9D3F7" w:sz="4"/>
+              <w:bottom w:val="single" w:color="D9D3F7" w:sz="4"/>
+              <w:right w:val="single" w:color="D9D3F7" w:sz="4"/>
+            </w:tcBorders>
+            <w:tcMar>
+              <w:top w:type="dxa" w:w="50"/>
+              <w:left w:type="dxa" w:w="90"/>
+              <w:bottom w:type="dxa" w:w="50"/>
+              <w:right w:type="dxa" w:w="90"/>
+            </w:tcMar>
+          </w:tcPr>
+          <w:p>
+            <w:r>
+              <w:rPr>
+                <w:b/>
+                <w:bCs/>
+                <w:sz w:val="18"/>
+                <w:szCs w:val="18"/>
+              </w:rPr>
+              <w:t xml:space="preserve">Ingrédients</w:t>
+            </w:r>
+            <w:r>
+              <w:rPr>
+                <w:sz w:val="18"/>
+                <w:szCs w:val="18"/>
+              </w:rPr>
+              <w:t xml:space="preserve"> (73)</w:t>
+            </w:r>
+          </w:p>
+        </w:tc>
+        <w:tc>
+          <w:tcPr>
+            <w:tcW w:type="dxa" w:w="3212"/>
+            <w:tcBorders>
+              <w:top w:val="single" w:color="D9D3F7" w:sz="4"/>
+              <w:left w:val="single" w:color="D9D3F7" w:sz="4"/>
+              <w:bottom w:val="single" w:color="D9D3F7" w:sz="4"/>
+              <w:right w:val="single" w:color="D9D3F7" w:sz="4"/>
+            </w:tcBorders>
+            <w:tcMar>
+              <w:top w:type="dxa" w:w="50"/>
+              <w:left w:type="dxa" w:w="90"/>
+              <w:bottom w:type="dxa" w:w="50"/>
+              <w:right w:type="dxa" w:w="90"/>
+            </w:tcMar>
+          </w:tcPr>
+          <w:p>
+            <w:r>
+              <w:rPr>
+                <w:sz w:val="18"/>
+                <w:szCs w:val="18"/>
+              </w:rPr>
+              <w:t xml:space="preserve">Stock des ingrédients suivis (fûts, matières), sorti de Stock.</w:t>
+            </w:r>
+          </w:p>
+        </w:tc>
+        <w:tc>
+          <w:tcPr>
+            <w:tcW w:type="dxa" w:w="3214"/>
+            <w:tcBorders>
+              <w:top w:val="single" w:color="D9D3F7" w:sz="4"/>
+              <w:left w:val="single" w:color="D9D3F7" w:sz="4"/>
+              <w:bottom w:val="single" w:color="D9D3F7" w:sz="4"/>
+              <w:right w:val="single" w:color="D9D3F7" w:sz="4"/>
+            </w:tcBorders>
+            <w:tcMar>
+              <w:top w:type="dxa" w:w="50"/>
+              <w:left w:type="dxa" w:w="90"/>
+              <w:bottom w:type="dxa" w:w="50"/>
+              <w:right w:type="dxa" w:w="90"/>
+            </w:tcMar>
+          </w:tcPr>
+          <w:p>
+            <w:r>
+              <w:rPr>
+                <w:rFonts w:ascii="Consolas" w:cs="Consolas" w:eastAsia="Consolas" w:hAnsi="Consolas"/>
+                <w:color w:val="3B2F8F"/>
+                <w:sz w:val="18"/>
+                <w:szCs w:val="18"/>
+              </w:rPr>
+              <w:t xml:space="preserve">pages/ingredients/Ingredients.tsx</w:t>
+            </w:r>
+            <w:r>
+              <w:rPr>
+                <w:sz w:val="18"/>
+                <w:szCs w:val="18"/>
+              </w:rPr>
+              <w:t xml:space="preserve"> (reprend </w:t>
+            </w:r>
+            <w:r>
+              <w:rPr>
+                <w:rFonts w:ascii="Consolas" w:cs="Consolas" w:eastAsia="Consolas" w:hAnsi="Consolas"/>
+                <w:color w:val="3B2F8F"/>
+                <w:sz w:val="18"/>
+                <w:szCs w:val="18"/>
+              </w:rPr>
+              <w:t xml:space="preserve">pages/stock/StockIngredients.tsx</w:t>
+            </w:r>
+            <w:r>
+              <w:rPr>
+                <w:sz w:val="18"/>
+                <w:szCs w:val="18"/>
+              </w:rPr>
+              <w:t xml:space="preserve">)</w:t>
+            </w:r>
+          </w:p>
+        </w:tc>
+      </w:tr>
+      <w:tr>
+        <w:trPr>
+          <w:tblHeader w:val="false"/>
+        </w:trPr>
+        <w:tc>
+          <w:tcPr>
+            <w:tcW w:type="dxa" w:w="3212"/>
+            <w:tcBorders>
+              <w:top w:val="single" w:color="D9D3F7" w:sz="4"/>
+              <w:left w:val="single" w:color="D9D3F7" w:sz="4"/>
+              <w:bottom w:val="single" w:color="D9D3F7" w:sz="4"/>
+              <w:right w:val="single" w:color="D9D3F7" w:sz="4"/>
+            </w:tcBorders>
+            <w:tcMar>
+              <w:top w:type="dxa" w:w="50"/>
+              <w:left w:type="dxa" w:w="90"/>
+              <w:bottom w:type="dxa" w:w="50"/>
+              <w:right w:type="dxa" w:w="90"/>
+            </w:tcMar>
+          </w:tcPr>
+          <w:p>
+            <w:r>
+              <w:rPr>
+                <w:b/>
+                <w:bCs/>
+                <w:sz w:val="18"/>
+                <w:szCs w:val="18"/>
+              </w:rPr>
+              <w:t xml:space="preserve">Achats</w:t>
+            </w:r>
+            <w:r>
+              <w:rPr>
+                <w:sz w:val="18"/>
+                <w:szCs w:val="18"/>
+              </w:rPr>
+              <w:t xml:space="preserve"> (73, 74, 75)</w:t>
+            </w:r>
+          </w:p>
+        </w:tc>
+        <w:tc>
+          <w:tcPr>
+            <w:tcW w:type="dxa" w:w="3212"/>
+            <w:tcBorders>
+              <w:top w:val="single" w:color="D9D3F7" w:sz="4"/>
+              <w:left w:val="single" w:color="D9D3F7" w:sz="4"/>
+              <w:bottom w:val="single" w:color="D9D3F7" w:sz="4"/>
+              <w:right w:val="single" w:color="D9D3F7" w:sz="4"/>
+            </w:tcBorders>
+            <w:tcMar>
+              <w:top w:type="dxa" w:w="50"/>
+              <w:left w:type="dxa" w:w="90"/>
+              <w:bottom w:type="dxa" w:w="50"/>
+              <w:right w:type="dxa" w:w="90"/>
+            </w:tcMar>
+          </w:tcPr>
+          <w:p>
+            <w:r>
+              <w:rPr>
+                <w:sz w:val="18"/>
+                <w:szCs w:val="18"/>
+              </w:rPr>
+              <w:t xml:space="preserve">Onglets Factures, Correspondances, Livraisons, Prix fournisseurs. Une facture se remplit depuis un </w:t>
+            </w:r>
+            <w:r>
+              <w:rPr>
+                <w:b/>
+                <w:bCs/>
+                <w:sz w:val="18"/>
+                <w:szCs w:val="18"/>
+              </w:rPr>
+              <w:t xml:space="preserve">Excel ou CSV</w:t>
+            </w:r>
+            <w:r>
+              <w:rPr>
+                <w:sz w:val="18"/>
+                <w:szCs w:val="18"/>
+              </w:rPr>
+              <w:t xml:space="preserve"> du fournisseur ; chaque ligne porte ses </w:t>
+            </w:r>
+            <w:r>
+              <w:rPr>
+                <w:b/>
+                <w:bCs/>
+                <w:sz w:val="18"/>
+                <w:szCs w:val="18"/>
+              </w:rPr>
+              <w:t xml:space="preserve">unités par colis</w:t>
+            </w:r>
+            <w:r>
+              <w:rPr>
+                <w:sz w:val="18"/>
+                <w:szCs w:val="18"/>
+              </w:rPr>
+              <w:t xml:space="preserve"> ; les </w:t>
+            </w:r>
+            <w:r>
+              <w:rPr>
+                <w:b/>
+                <w:bCs/>
+                <w:sz w:val="18"/>
+                <w:szCs w:val="18"/>
+              </w:rPr>
+              <w:t xml:space="preserve">correspondances</w:t>
+            </w:r>
+            <w:r>
+              <w:rPr>
+                <w:sz w:val="18"/>
+                <w:szCs w:val="18"/>
+              </w:rPr>
+              <w:t xml:space="preserve"> (article du fournisseur → produit, colis) s'apprennent à chaque facture et se corrigent dans l'onglet ; des </w:t>
+            </w:r>
+            <w:r>
+              <w:rPr>
+                <w:b/>
+                <w:bCs/>
+                <w:sz w:val="18"/>
+                <w:szCs w:val="18"/>
+              </w:rPr>
+              <w:t xml:space="preserve">alertes</w:t>
+            </w:r>
+            <w:r>
+              <w:rPr>
+                <w:sz w:val="18"/>
+                <w:szCs w:val="18"/>
+              </w:rPr>
+              <w:t xml:space="preserve"> (total annoncé, colis oublié, prix ou quantité inhabituels) se cochent avant de valider ; la </w:t>
+            </w:r>
+            <w:r>
+              <w:rPr>
+                <w:b/>
+                <w:bCs/>
+                <w:sz w:val="18"/>
+                <w:szCs w:val="18"/>
+              </w:rPr>
+              <w:t xml:space="preserve">validation fait entrer les produits en réserve</w:t>
+            </w:r>
+            <w:r>
+              <w:rPr>
+                <w:sz w:val="18"/>
+                <w:szCs w:val="18"/>
+              </w:rPr>
+              <w:t xml:space="preserve"> ; « Pour le comptable » : un zip par période (pièces, factures de vente en PDF, récapitulatif Excel).</w:t>
+            </w:r>
+          </w:p>
+        </w:tc>
+        <w:tc>
+          <w:tcPr>
+            <w:tcW w:type="dxa" w:w="3214"/>
+            <w:tcBorders>
+              <w:top w:val="single" w:color="D9D3F7" w:sz="4"/>
+              <w:left w:val="single" w:color="D9D3F7" w:sz="4"/>
+              <w:bottom w:val="single" w:color="D9D3F7" w:sz="4"/>
+              <w:right w:val="single" w:color="D9D3F7" w:sz="4"/>
+            </w:tcBorders>
+            <w:tcMar>
+              <w:top w:type="dxa" w:w="50"/>
+              <w:left w:type="dxa" w:w="90"/>
+              <w:bottom w:type="dxa" w:w="50"/>
+              <w:right w:type="dxa" w:w="90"/>
+            </w:tcMar>
+          </w:tcPr>
+          <w:p>
+            <w:r>
+              <w:rPr>
+                <w:rFonts w:ascii="Consolas" w:cs="Consolas" w:eastAsia="Consolas" w:hAnsi="Consolas"/>
+                <w:color w:val="3B2F8F"/>
+                <w:sz w:val="18"/>
+                <w:szCs w:val="18"/>
+              </w:rPr>
+              <w:t xml:space="preserve">packages/domain/src/factures-import.ts</w:t>
+            </w:r>
+            <w:r>
+              <w:rPr>
+                <w:sz w:val="18"/>
+                <w:szCs w:val="18"/>
+              </w:rPr>
+              <w:t xml:space="preserve">, </w:t>
+            </w:r>
+            <w:r>
+              <w:rPr>
+                <w:rFonts w:ascii="Consolas" w:cs="Consolas" w:eastAsia="Consolas" w:hAnsi="Consolas"/>
+                <w:color w:val="3B2F8F"/>
+                <w:sz w:val="18"/>
+                <w:szCs w:val="18"/>
+              </w:rPr>
+              <w:t xml:space="preserve">factures.ts</w:t>
+            </w:r>
+            <w:r>
+              <w:rPr>
+                <w:sz w:val="18"/>
+                <w:szCs w:val="18"/>
+              </w:rPr>
+              <w:t xml:space="preserve"> ; </w:t>
+            </w:r>
+            <w:r>
+              <w:rPr>
+                <w:rFonts w:ascii="Consolas" w:cs="Consolas" w:eastAsia="Consolas" w:hAnsi="Consolas"/>
+                <w:color w:val="3B2F8F"/>
+                <w:sz w:val="18"/>
+                <w:szCs w:val="18"/>
+              </w:rPr>
+              <w:t xml:space="preserve">apps/api/src/routes/factures.ts</w:t>
+            </w:r>
+            <w:r>
+              <w:rPr>
+                <w:sz w:val="18"/>
+                <w:szCs w:val="18"/>
+              </w:rPr>
+              <w:t xml:space="preserve">, </w:t>
+            </w:r>
+            <w:r>
+              <w:rPr>
+                <w:rFonts w:ascii="Consolas" w:cs="Consolas" w:eastAsia="Consolas" w:hAnsi="Consolas"/>
+                <w:color w:val="3B2F8F"/>
+                <w:sz w:val="18"/>
+                <w:szCs w:val="18"/>
+              </w:rPr>
+              <w:t xml:space="preserve">routes/stock.ts</w:t>
+            </w:r>
+            <w:r>
+              <w:rPr>
+                <w:sz w:val="18"/>
+                <w:szCs w:val="18"/>
+              </w:rPr>
+              <w:t xml:space="preserve"> (</w:t>
+            </w:r>
+            <w:r>
+              <w:rPr>
+                <w:rFonts w:ascii="Consolas" w:cs="Consolas" w:eastAsia="Consolas" w:hAnsi="Consolas"/>
+                <w:color w:val="3B2F8F"/>
+                <w:sz w:val="18"/>
+                <w:szCs w:val="18"/>
+              </w:rPr>
+              <w:t xml:space="preserve">enregistrerLivraison</w:t>
+            </w:r>
+            <w:r>
+              <w:rPr>
+                <w:sz w:val="18"/>
+                <w:szCs w:val="18"/>
+              </w:rPr>
+              <w:t xml:space="preserve">), </w:t>
+            </w:r>
+            <w:r>
+              <w:rPr>
+                <w:rFonts w:ascii="Consolas" w:cs="Consolas" w:eastAsia="Consolas" w:hAnsi="Consolas"/>
+                <w:color w:val="3B2F8F"/>
+                <w:sz w:val="18"/>
+                <w:szCs w:val="18"/>
+              </w:rPr>
+              <w:t xml:space="preserve">apps/api/src/pdf-facture.ts</w:t>
+            </w:r>
+            <w:r>
+              <w:rPr>
+                <w:sz w:val="18"/>
+                <w:szCs w:val="18"/>
+              </w:rPr>
+              <w:t xml:space="preserve"> ; </w:t>
+            </w:r>
+            <w:r>
+              <w:rPr>
+                <w:rFonts w:ascii="Consolas" w:cs="Consolas" w:eastAsia="Consolas" w:hAnsi="Consolas"/>
+                <w:color w:val="3B2F8F"/>
+                <w:sz w:val="18"/>
+                <w:szCs w:val="18"/>
+              </w:rPr>
+              <w:t xml:space="preserve">apps/web/src/pages/achats/</w:t>
+            </w:r>
+            <w:r>
+              <w:rPr>
+                <w:sz w:val="18"/>
+                <w:szCs w:val="18"/>
+              </w:rPr>
+              <w:t xml:space="preserve">, </w:t>
+            </w:r>
+            <w:r>
+              <w:rPr>
+                <w:rFonts w:ascii="Consolas" w:cs="Consolas" w:eastAsia="Consolas" w:hAnsi="Consolas"/>
+                <w:color w:val="3B2F8F"/>
+                <w:sz w:val="18"/>
+                <w:szCs w:val="18"/>
+              </w:rPr>
+              <w:t xml:space="preserve">pages/factures/Factures.tsx</w:t>
+            </w:r>
+          </w:p>
+        </w:tc>
+      </w:tr>
+      <w:tr>
+        <w:trPr>
+          <w:tblHeader w:val="false"/>
+        </w:trPr>
+        <w:tc>
+          <w:tcPr>
+            <w:tcW w:type="dxa" w:w="3212"/>
+            <w:tcBorders>
+              <w:top w:val="single" w:color="D9D3F7" w:sz="4"/>
+              <w:left w:val="single" w:color="D9D3F7" w:sz="4"/>
+              <w:bottom w:val="single" w:color="D9D3F7" w:sz="4"/>
+              <w:right w:val="single" w:color="D9D3F7" w:sz="4"/>
+            </w:tcBorders>
+            <w:tcMar>
+              <w:top w:type="dxa" w:w="50"/>
+              <w:left w:type="dxa" w:w="90"/>
+              <w:bottom w:type="dxa" w:w="50"/>
+              <w:right w:type="dxa" w:w="90"/>
+            </w:tcMar>
+          </w:tcPr>
+          <w:p>
+            <w:r>
+              <w:rPr>
+                <w:b/>
+                <w:bCs/>
+                <w:sz w:val="18"/>
+                <w:szCs w:val="18"/>
+              </w:rPr>
+              <w:t xml:space="preserve">Caisses connectées</w:t>
+            </w:r>
+            <w:r>
+              <w:rPr>
+                <w:sz w:val="18"/>
+                <w:szCs w:val="18"/>
+              </w:rPr>
+              <w:t xml:space="preserve"> (69, 72)</w:t>
+            </w:r>
+          </w:p>
+        </w:tc>
+        <w:tc>
+          <w:tcPr>
+            <w:tcW w:type="dxa" w:w="3212"/>
+            <w:tcBorders>
+              <w:top w:val="single" w:color="D9D3F7" w:sz="4"/>
+              <w:left w:val="single" w:color="D9D3F7" w:sz="4"/>
+              <w:bottom w:val="single" w:color="D9D3F7" w:sz="4"/>
+              <w:right w:val="single" w:color="D9D3F7" w:sz="4"/>
+            </w:tcBorders>
+            <w:tcMar>
+              <w:top w:type="dxa" w:w="50"/>
+              <w:left w:type="dxa" w:w="90"/>
+              <w:bottom w:type="dxa" w:w="50"/>
+              <w:right w:type="dxa" w:w="90"/>
+            </w:tcMar>
+          </w:tcPr>
+          <w:p>
+            <w:r>
+              <w:rPr>
+                <w:sz w:val="18"/>
+                <w:szCs w:val="18"/>
+              </w:rPr>
+              <w:t xml:space="preserve">Exports de L'Addition lus seuls (feuille et colonnes reconnues, « - » = vide, remises et offerts) ; </w:t>
+            </w:r>
+            <w:r>
+              <w:rPr>
+                <w:b/>
+                <w:bCs/>
+                <w:sz w:val="18"/>
+                <w:szCs w:val="18"/>
+              </w:rPr>
+              <w:t xml:space="preserve">annuler un import</w:t>
+            </w:r>
+            <w:r>
+              <w:rPr>
+                <w:sz w:val="18"/>
+                <w:szCs w:val="18"/>
+              </w:rPr>
+              <w:t xml:space="preserve"> raté ; nouveau système « Click &amp; Collect (application Break Eat) » compté à part dans Résultats.</w:t>
+            </w:r>
+          </w:p>
+        </w:tc>
+        <w:tc>
+          <w:tcPr>
+            <w:tcW w:type="dxa" w:w="3214"/>
+            <w:tcBorders>
+              <w:top w:val="single" w:color="D9D3F7" w:sz="4"/>
+              <w:left w:val="single" w:color="D9D3F7" w:sz="4"/>
+              <w:bottom w:val="single" w:color="D9D3F7" w:sz="4"/>
+              <w:right w:val="single" w:color="D9D3F7" w:sz="4"/>
+            </w:tcBorders>
+            <w:tcMar>
+              <w:top w:type="dxa" w:w="50"/>
+              <w:left w:type="dxa" w:w="90"/>
+              <w:bottom w:type="dxa" w:w="50"/>
+              <w:right w:type="dxa" w:w="90"/>
+            </w:tcMar>
+          </w:tcPr>
+          <w:p>
+            <w:r>
+              <w:rPr>
+                <w:rFonts w:ascii="Consolas" w:cs="Consolas" w:eastAsia="Consolas" w:hAnsi="Consolas"/>
+                <w:color w:val="3B2F8F"/>
+                <w:sz w:val="18"/>
+                <w:szCs w:val="18"/>
+              </w:rPr>
+              <w:t xml:space="preserve">packages/domain/src/caisses-externes.ts</w:t>
+            </w:r>
+            <w:r>
+              <w:rPr>
+                <w:sz w:val="18"/>
+                <w:szCs w:val="18"/>
+              </w:rPr>
+              <w:t xml:space="preserve">, </w:t>
+            </w:r>
+            <w:r>
+              <w:rPr>
+                <w:rFonts w:ascii="Consolas" w:cs="Consolas" w:eastAsia="Consolas" w:hAnsi="Consolas"/>
+                <w:color w:val="3B2F8F"/>
+                <w:sz w:val="18"/>
+                <w:szCs w:val="18"/>
+              </w:rPr>
+              <w:t xml:space="preserve">apps/api/src/routes/caisses-externes.ts</w:t>
+            </w:r>
+            <w:r>
+              <w:rPr>
+                <w:sz w:val="18"/>
+                <w:szCs w:val="18"/>
+              </w:rPr>
+              <w:t xml:space="preserve">, </w:t>
+            </w:r>
+            <w:r>
+              <w:rPr>
+                <w:rFonts w:ascii="Consolas" w:cs="Consolas" w:eastAsia="Consolas" w:hAnsi="Consolas"/>
+                <w:color w:val="3B2F8F"/>
+                <w:sz w:val="18"/>
+                <w:szCs w:val="18"/>
+              </w:rPr>
+              <w:t xml:space="preserve">pages/caisses-connectees/</w:t>
+            </w:r>
+          </w:p>
+        </w:tc>
+      </w:tr>
+      <w:tr>
+        <w:trPr>
+          <w:tblHeader w:val="false"/>
+        </w:trPr>
+        <w:tc>
+          <w:tcPr>
+            <w:tcW w:type="dxa" w:w="3212"/>
+            <w:tcBorders>
+              <w:top w:val="single" w:color="D9D3F7" w:sz="4"/>
+              <w:left w:val="single" w:color="D9D3F7" w:sz="4"/>
+              <w:bottom w:val="single" w:color="D9D3F7" w:sz="4"/>
+              <w:right w:val="single" w:color="D9D3F7" w:sz="4"/>
+            </w:tcBorders>
+            <w:tcMar>
+              <w:top w:type="dxa" w:w="50"/>
+              <w:left w:type="dxa" w:w="90"/>
+              <w:bottom w:type="dxa" w:w="50"/>
+              <w:right w:type="dxa" w:w="90"/>
+            </w:tcMar>
+          </w:tcPr>
+          <w:p>
+            <w:r>
+              <w:rPr>
+                <w:b/>
+                <w:bCs/>
+                <w:sz w:val="18"/>
+                <w:szCs w:val="18"/>
+              </w:rPr>
+              <w:t xml:space="preserve">Événements privés</w:t>
+            </w:r>
+            <w:r>
+              <w:rPr>
+                <w:sz w:val="18"/>
+                <w:szCs w:val="18"/>
+              </w:rPr>
+              <w:t xml:space="preserve"> (70, 71)</w:t>
+            </w:r>
+          </w:p>
+        </w:tc>
+        <w:tc>
+          <w:tcPr>
+            <w:tcW w:type="dxa" w:w="3212"/>
+            <w:tcBorders>
+              <w:top w:val="single" w:color="D9D3F7" w:sz="4"/>
+              <w:left w:val="single" w:color="D9D3F7" w:sz="4"/>
+              <w:bottom w:val="single" w:color="D9D3F7" w:sz="4"/>
+              <w:right w:val="single" w:color="D9D3F7" w:sz="4"/>
+            </w:tcBorders>
+            <w:tcMar>
+              <w:top w:type="dxa" w:w="50"/>
+              <w:left w:type="dxa" w:w="90"/>
+              <w:bottom w:type="dxa" w:w="50"/>
+              <w:right w:type="dxa" w:w="90"/>
+            </w:tcMar>
+          </w:tcPr>
+          <w:p>
+            <w:r>
+              <w:rPr>
+                <w:sz w:val="18"/>
+                <w:szCs w:val="18"/>
+              </w:rPr>
+              <w:t xml:space="preserve">À la clôture, les produits du catalogue sortent de la réserve centrale (un produit fait d'un ingrédient suivi sort ses ingrédients) ; carte « À sortir / Sorti de la réserve ».</w:t>
+            </w:r>
+          </w:p>
+        </w:tc>
+        <w:tc>
+          <w:tcPr>
+            <w:tcW w:type="dxa" w:w="3214"/>
+            <w:tcBorders>
+              <w:top w:val="single" w:color="D9D3F7" w:sz="4"/>
+              <w:left w:val="single" w:color="D9D3F7" w:sz="4"/>
+              <w:bottom w:val="single" w:color="D9D3F7" w:sz="4"/>
+              <w:right w:val="single" w:color="D9D3F7" w:sz="4"/>
+            </w:tcBorders>
+            <w:tcMar>
+              <w:top w:type="dxa" w:w="50"/>
+              <w:left w:type="dxa" w:w="90"/>
+              <w:bottom w:type="dxa" w:w="50"/>
+              <w:right w:type="dxa" w:w="90"/>
+            </w:tcMar>
+          </w:tcPr>
+          <w:p>
+            <w:r>
+              <w:rPr>
+                <w:rFonts w:ascii="Consolas" w:cs="Consolas" w:eastAsia="Consolas" w:hAnsi="Consolas"/>
+                <w:color w:val="3B2F8F"/>
+                <w:sz w:val="18"/>
+                <w:szCs w:val="18"/>
+              </w:rPr>
+              <w:t xml:space="preserve">apps/api/src/routes/evenements-prives.ts</w:t>
+            </w:r>
+            <w:r>
+              <w:rPr>
+                <w:sz w:val="18"/>
+                <w:szCs w:val="18"/>
+              </w:rPr>
+              <w:t xml:space="preserve"> (</w:t>
+            </w:r>
+            <w:r>
+              <w:rPr>
+                <w:rFonts w:ascii="Consolas" w:cs="Consolas" w:eastAsia="Consolas" w:hAnsi="Consolas"/>
+                <w:color w:val="3B2F8F"/>
+                <w:sz w:val="18"/>
+                <w:szCs w:val="18"/>
+              </w:rPr>
+              <w:t xml:space="preserve">sortirDeLaReserve</w:t>
+            </w:r>
+            <w:r>
+              <w:rPr>
+                <w:sz w:val="18"/>
+                <w:szCs w:val="18"/>
+              </w:rPr>
+              <w:t xml:space="preserve">, </w:t>
+            </w:r>
+            <w:r>
+              <w:rPr>
+                <w:rFonts w:ascii="Consolas" w:cs="Consolas" w:eastAsia="Consolas" w:hAnsi="Consolas"/>
+                <w:color w:val="3B2F8F"/>
+                <w:sz w:val="18"/>
+                <w:szCs w:val="18"/>
+              </w:rPr>
+              <w:t xml:space="preserve">sortieStockDe</w:t>
+            </w:r>
+            <w:r>
+              <w:rPr>
+                <w:sz w:val="18"/>
+                <w:szCs w:val="18"/>
+              </w:rPr>
+              <w:t xml:space="preserve">), </w:t>
+            </w:r>
+            <w:r>
+              <w:rPr>
+                <w:rFonts w:ascii="Consolas" w:cs="Consolas" w:eastAsia="Consolas" w:hAnsi="Consolas"/>
+                <w:color w:val="3B2F8F"/>
+                <w:sz w:val="18"/>
+                <w:szCs w:val="18"/>
+              </w:rPr>
+              <w:t xml:space="preserve">pages/prives/EvenementPrive.tsx</w:t>
+            </w:r>
+          </w:p>
+        </w:tc>
+      </w:tr>
+      <w:tr>
+        <w:trPr>
+          <w:tblHeader w:val="false"/>
+        </w:trPr>
+        <w:tc>
+          <w:tcPr>
+            <w:tcW w:type="dxa" w:w="3212"/>
+            <w:tcBorders>
+              <w:top w:val="single" w:color="D9D3F7" w:sz="4"/>
+              <w:left w:val="single" w:color="D9D3F7" w:sz="4"/>
+              <w:bottom w:val="single" w:color="D9D3F7" w:sz="4"/>
+              <w:right w:val="single" w:color="D9D3F7" w:sz="4"/>
+            </w:tcBorders>
+            <w:tcMar>
+              <w:top w:type="dxa" w:w="50"/>
+              <w:left w:type="dxa" w:w="90"/>
+              <w:bottom w:type="dxa" w:w="50"/>
+              <w:right w:type="dxa" w:w="90"/>
+            </w:tcMar>
+          </w:tcPr>
+          <w:p>
+            <w:r>
+              <w:rPr>
+                <w:b/>
+                <w:bCs/>
+                <w:sz w:val="18"/>
+                <w:szCs w:val="18"/>
+              </w:rPr>
+              <w:t xml:space="preserve">Rapport de soirée</w:t>
+            </w:r>
+            <w:r>
+              <w:rPr>
+                <w:sz w:val="18"/>
+                <w:szCs w:val="18"/>
+              </w:rPr>
+              <w:t xml:space="preserve"> (71)</w:t>
+            </w:r>
+          </w:p>
+        </w:tc>
+        <w:tc>
+          <w:tcPr>
+            <w:tcW w:type="dxa" w:w="3212"/>
+            <w:tcBorders>
+              <w:top w:val="single" w:color="D9D3F7" w:sz="4"/>
+              <w:left w:val="single" w:color="D9D3F7" w:sz="4"/>
+              <w:bottom w:val="single" w:color="D9D3F7" w:sz="4"/>
+              <w:right w:val="single" w:color="D9D3F7" w:sz="4"/>
+            </w:tcBorders>
+            <w:tcMar>
+              <w:top w:type="dxa" w:w="50"/>
+              <w:left w:type="dxa" w:w="90"/>
+              <w:bottom w:type="dxa" w:w="50"/>
+              <w:right w:type="dxa" w:w="90"/>
+            </w:tcMar>
+          </w:tcPr>
+          <w:p>
+            <w:r>
+              <w:rPr>
+                <w:sz w:val="18"/>
+                <w:szCs w:val="18"/>
+              </w:rPr>
+              <w:t xml:space="preserve">Section « Stock de la soirée », stand par stand (champ facultatif des rapports figés depuis le 2026-10-21).</w:t>
+            </w:r>
+          </w:p>
+        </w:tc>
+        <w:tc>
+          <w:tcPr>
+            <w:tcW w:type="dxa" w:w="3214"/>
+            <w:tcBorders>
+              <w:top w:val="single" w:color="D9D3F7" w:sz="4"/>
+              <w:left w:val="single" w:color="D9D3F7" w:sz="4"/>
+              <w:bottom w:val="single" w:color="D9D3F7" w:sz="4"/>
+              <w:right w:val="single" w:color="D9D3F7" w:sz="4"/>
+            </w:tcBorders>
+            <w:tcMar>
+              <w:top w:type="dxa" w:w="50"/>
+              <w:left w:type="dxa" w:w="90"/>
+              <w:bottom w:type="dxa" w:w="50"/>
+              <w:right w:type="dxa" w:w="90"/>
+            </w:tcMar>
+          </w:tcPr>
+          <w:p>
+            <w:r>
+              <w:rPr>
+                <w:rFonts w:ascii="Consolas" w:cs="Consolas" w:eastAsia="Consolas" w:hAnsi="Consolas"/>
+                <w:color w:val="3B2F8F"/>
+                <w:sz w:val="18"/>
+                <w:szCs w:val="18"/>
+              </w:rPr>
+              <w:t xml:space="preserve">packages/domain/src/rapport-soiree.ts</w:t>
+            </w:r>
+            <w:r>
+              <w:rPr>
+                <w:sz w:val="18"/>
+                <w:szCs w:val="18"/>
+              </w:rPr>
+              <w:t xml:space="preserve"> (</w:t>
+            </w:r>
+            <w:r>
+              <w:rPr>
+                <w:rFonts w:ascii="Consolas" w:cs="Consolas" w:eastAsia="Consolas" w:hAnsi="Consolas"/>
+                <w:color w:val="3B2F8F"/>
+                <w:sz w:val="18"/>
+                <w:szCs w:val="18"/>
+              </w:rPr>
+              <w:t xml:space="preserve">bilanDeStock</w:t>
+            </w:r>
+            <w:r>
+              <w:rPr>
+                <w:sz w:val="18"/>
+                <w:szCs w:val="18"/>
+              </w:rPr>
+              <w:t xml:space="preserve">), </w:t>
+            </w:r>
+            <w:r>
+              <w:rPr>
+                <w:rFonts w:ascii="Consolas" w:cs="Consolas" w:eastAsia="Consolas" w:hAnsi="Consolas"/>
+                <w:color w:val="3B2F8F"/>
+                <w:sz w:val="18"/>
+                <w:szCs w:val="18"/>
+              </w:rPr>
+              <w:t xml:space="preserve">routes/rapport-soiree.ts</w:t>
+            </w:r>
+          </w:p>
+        </w:tc>
+      </w:tr>
+      <w:tr>
+        <w:trPr>
+          <w:tblHeader w:val="false"/>
+        </w:trPr>
+        <w:tc>
+          <w:tcPr>
+            <w:tcW w:type="dxa" w:w="3212"/>
+            <w:tcBorders>
+              <w:top w:val="single" w:color="D9D3F7" w:sz="4"/>
+              <w:left w:val="single" w:color="D9D3F7" w:sz="4"/>
+              <w:bottom w:val="single" w:color="D9D3F7" w:sz="4"/>
+              <w:right w:val="single" w:color="D9D3F7" w:sz="4"/>
+            </w:tcBorders>
+            <w:tcMar>
+              <w:top w:type="dxa" w:w="50"/>
+              <w:left w:type="dxa" w:w="90"/>
+              <w:bottom w:type="dxa" w:w="50"/>
+              <w:right w:type="dxa" w:w="90"/>
+            </w:tcMar>
+          </w:tcPr>
+          <w:p>
+            <w:r>
+              <w:rPr>
+                <w:b/>
+                <w:bCs/>
+                <w:sz w:val="18"/>
+                <w:szCs w:val="18"/>
+              </w:rPr>
+              <w:t xml:space="preserve">Paramètres › Produits &amp; prix</w:t>
+            </w:r>
+            <w:r>
+              <w:rPr>
+                <w:sz w:val="18"/>
+                <w:szCs w:val="18"/>
+              </w:rPr>
+              <w:t xml:space="preserve"> (70, 72)</w:t>
+            </w:r>
+          </w:p>
+        </w:tc>
+        <w:tc>
+          <w:tcPr>
+            <w:tcW w:type="dxa" w:w="3212"/>
+            <w:tcBorders>
+              <w:top w:val="single" w:color="D9D3F7" w:sz="4"/>
+              <w:left w:val="single" w:color="D9D3F7" w:sz="4"/>
+              <w:bottom w:val="single" w:color="D9D3F7" w:sz="4"/>
+              <w:right w:val="single" w:color="D9D3F7" w:sz="4"/>
+            </w:tcBorders>
+            <w:tcMar>
+              <w:top w:type="dxa" w:w="50"/>
+              <w:left w:type="dxa" w:w="90"/>
+              <w:bottom w:type="dxa" w:w="50"/>
+              <w:right w:type="dxa" w:w="90"/>
+            </w:tcMar>
+          </w:tcPr>
+          <w:p>
+            <w:r>
+              <w:rPr>
+                <w:sz w:val="18"/>
+                <w:szCs w:val="18"/>
+              </w:rPr>
+              <w:t xml:space="preserve">Famille de chaque catégorie (boisson, nourriture, autre ; devinée tant qu'elle n'est pas choisie) ; TVA à 2,1 % retirée des choix.</w:t>
+            </w:r>
+          </w:p>
+        </w:tc>
+        <w:tc>
+          <w:tcPr>
+            <w:tcW w:type="dxa" w:w="3214"/>
+            <w:tcBorders>
+              <w:top w:val="single" w:color="D9D3F7" w:sz="4"/>
+              <w:left w:val="single" w:color="D9D3F7" w:sz="4"/>
+              <w:bottom w:val="single" w:color="D9D3F7" w:sz="4"/>
+              <w:right w:val="single" w:color="D9D3F7" w:sz="4"/>
+            </w:tcBorders>
+            <w:tcMar>
+              <w:top w:type="dxa" w:w="50"/>
+              <w:left w:type="dxa" w:w="90"/>
+              <w:bottom w:type="dxa" w:w="50"/>
+              <w:right w:type="dxa" w:w="90"/>
+            </w:tcMar>
+          </w:tcPr>
+          <w:p>
+            <w:r>
+              <w:rPr>
+                <w:rFonts w:ascii="Consolas" w:cs="Consolas" w:eastAsia="Consolas" w:hAnsi="Consolas"/>
+                <w:color w:val="3B2F8F"/>
+                <w:sz w:val="18"/>
+                <w:szCs w:val="18"/>
+              </w:rPr>
+              <w:t xml:space="preserve">pages/parametres/Produits.tsx</w:t>
+            </w:r>
+            <w:r>
+              <w:rPr>
+                <w:sz w:val="18"/>
+                <w:szCs w:val="18"/>
+              </w:rPr>
+              <w:t xml:space="preserve">, </w:t>
+            </w:r>
+            <w:r>
+              <w:rPr>
+                <w:rFonts w:ascii="Consolas" w:cs="Consolas" w:eastAsia="Consolas" w:hAnsi="Consolas"/>
+                <w:color w:val="3B2F8F"/>
+                <w:sz w:val="18"/>
+                <w:szCs w:val="18"/>
+              </w:rPr>
+              <w:t xml:space="preserve">packages/domain/src/tva.ts</w:t>
+            </w:r>
+            <w:r>
+              <w:rPr>
+                <w:sz w:val="18"/>
+                <w:szCs w:val="18"/>
+              </w:rPr>
+              <w:t xml:space="preserve"> (</w:t>
+            </w:r>
+            <w:r>
+              <w:rPr>
+                <w:rFonts w:ascii="Consolas" w:cs="Consolas" w:eastAsia="Consolas" w:hAnsi="Consolas"/>
+                <w:color w:val="3B2F8F"/>
+                <w:sz w:val="18"/>
+                <w:szCs w:val="18"/>
+              </w:rPr>
+              <w:t xml:space="preserve">tauxTvaProposes</w:t>
+            </w:r>
+            <w:r>
+              <w:rPr>
+                <w:sz w:val="18"/>
+                <w:szCs w:val="18"/>
+              </w:rPr>
+              <w:t xml:space="preserve">)</w:t>
+            </w:r>
+          </w:p>
+        </w:tc>
+      </w:tr>
+    </w:tbl>
+    <w:p/>
+    <w:p>
+      <w:r>
+        <w:rPr>
+          <w:b/>
+          <w:bCs/>
+        </w:rPr>
+        <w:t xml:space="preserve">Le chemin d'une facture fournisseur</w:t>
+      </w:r>
+      <w:r>
+        <w:t xml:space="preserve">, de bout en bout :</w:t>
+      </w:r>
+    </w:p>
+    <w:p>
+      <w:pPr>
+        <w:pStyle w:val="ListParagraph"/>
+        <w:numPr>
+          <w:ilvl w:val="0"/>
+          <w:numId w:val="5"/>
+        </w:numPr>
+      </w:pPr>
+      <w:r>
+        <w:t xml:space="preserve">Achats › Factures › « Remplir depuis un fichier » : </w:t>
+      </w:r>
+      <w:r>
+        <w:rPr>
+          <w:rFonts w:ascii="Consolas" w:cs="Consolas" w:eastAsia="Consolas" w:hAnsi="Consolas"/>
+          <w:color w:val="3B2F8F"/>
+          <w:sz w:val="18"/>
+          <w:szCs w:val="18"/>
+        </w:rPr>
+        <w:t xml:space="preserve">lireFichierVentes</w:t>
+      </w:r>
+      <w:r>
+        <w:t xml:space="preserve"> (classeur → CSV) puis </w:t>
+      </w:r>
+      <w:r>
+        <w:rPr>
+          <w:rFonts w:ascii="Consolas" w:cs="Consolas" w:eastAsia="Consolas" w:hAnsi="Consolas"/>
+          <w:color w:val="3B2F8F"/>
+          <w:sz w:val="18"/>
+          <w:szCs w:val="18"/>
+        </w:rPr>
+        <w:t xml:space="preserve">lireFactureExport</w:t>
+      </w:r>
+      <w:r>
+        <w:t xml:space="preserve"> (colonnes devinées, lignes de total ignorées, quantités au poids écartées).</w:t>
+      </w:r>
+    </w:p>
+    <w:p>
+      <w:pPr>
+        <w:pStyle w:val="ListParagraph"/>
+        <w:numPr>
+          <w:ilvl w:val="0"/>
+          <w:numId w:val="5"/>
+        </w:numPr>
+      </w:pPr>
+      <w:r>
+        <w:t xml:space="preserve">Chaque ligne reprend la correspondance apprise (</w:t>
+      </w:r>
+      <w:r>
+        <w:rPr>
+          <w:rFonts w:ascii="Consolas" w:cs="Consolas" w:eastAsia="Consolas" w:hAnsi="Consolas"/>
+          <w:color w:val="3B2F8F"/>
+          <w:sz w:val="18"/>
+          <w:szCs w:val="18"/>
+        </w:rPr>
+        <w:t xml:space="preserve">cleArticle</w:t>
+      </w:r>
+      <w:r>
+        <w:t xml:space="preserve"> : code, sinon libellé, par fournisseur normalisé), sinon le produit du même nom, sinon le plus ressemblant (« proposé : à vérifier ») ; colis lu ou deviné (</w:t>
+      </w:r>
+      <w:r>
+        <w:rPr>
+          <w:rFonts w:ascii="Consolas" w:cs="Consolas" w:eastAsia="Consolas" w:hAnsi="Consolas"/>
+          <w:color w:val="3B2F8F"/>
+          <w:sz w:val="18"/>
+          <w:szCs w:val="18"/>
+        </w:rPr>
+        <w:t xml:space="preserve">colisDevine</w:t>
+      </w:r>
+      <w:r>
+        <w:t xml:space="preserve">).</w:t>
+      </w:r>
+    </w:p>
+    <w:p>
+      <w:pPr>
+        <w:pStyle w:val="ListParagraph"/>
+        <w:numPr>
+          <w:ilvl w:val="0"/>
+          <w:numId w:val="5"/>
+        </w:numPr>
+      </w:pPr>
+      <w:r>
+        <w:rPr>
+          <w:rFonts w:ascii="Consolas" w:cs="Consolas" w:eastAsia="Consolas" w:hAnsi="Consolas"/>
+          <w:color w:val="3B2F8F"/>
+          <w:sz w:val="18"/>
+          <w:szCs w:val="18"/>
+        </w:rPr>
+        <w:t xml:space="preserve">POST /api/factures</w:t>
+      </w:r>
+      <w:r>
+        <w:t xml:space="preserve"> enregistre la facture et </w:t>
+      </w:r>
+      <w:r>
+        <w:rPr>
+          <w:b/>
+          <w:bCs/>
+        </w:rPr>
+        <w:t xml:space="preserve">apprend</w:t>
+      </w:r>
+      <w:r>
+        <w:t xml:space="preserve"> les correspondances (</w:t>
+      </w:r>
+      <w:r>
+        <w:rPr>
+          <w:rFonts w:ascii="Consolas" w:cs="Consolas" w:eastAsia="Consolas" w:hAnsi="Consolas"/>
+          <w:color w:val="3B2F8F"/>
+          <w:sz w:val="18"/>
+          <w:szCs w:val="18"/>
+        </w:rPr>
+        <w:t xml:space="preserve">apprendreCorrespondances</w:t>
+      </w:r>
+      <w:r>
+        <w:t xml:space="preserve">).</w:t>
+      </w:r>
+    </w:p>
+    <w:p>
+      <w:pPr>
+        <w:pStyle w:val="ListParagraph"/>
+        <w:numPr>
+          <w:ilvl w:val="0"/>
+          <w:numId w:val="5"/>
+        </w:numPr>
+      </w:pPr>
+      <w:r>
+        <w:t xml:space="preserve">L'état de la facture recalcule le rapprochement </w:t>
+      </w:r>
+      <w:r>
+        <w:rPr>
+          <w:b/>
+          <w:bCs/>
+        </w:rPr>
+        <w:t xml:space="preserve">à l'unité vendue</w:t>
+      </w:r>
+      <w:r>
+        <w:t xml:space="preserve"> (</w:t>
+      </w:r>
+      <w:r>
+        <w:rPr>
+          <w:rFonts w:ascii="Consolas" w:cs="Consolas" w:eastAsia="Consolas" w:hAnsi="Consolas"/>
+          <w:color w:val="3B2F8F"/>
+          <w:sz w:val="18"/>
+          <w:szCs w:val="18"/>
+        </w:rPr>
+        <w:t xml:space="preserve">enUnites</w:t>
+      </w:r>
+      <w:r>
+        <w:t xml:space="preserve"> : quantité × colis, prix ÷ colis) et les </w:t>
+      </w:r>
+      <w:r>
+        <w:rPr>
+          <w:b/>
+          <w:bCs/>
+        </w:rPr>
+        <w:t xml:space="preserve">alertes</w:t>
+      </w:r>
+      <w:r>
+        <w:t xml:space="preserve"> (</w:t>
+      </w:r>
+      <w:r>
+        <w:rPr>
+          <w:rFonts w:ascii="Consolas" w:cs="Consolas" w:eastAsia="Consolas" w:hAnsi="Consolas"/>
+          <w:color w:val="3B2F8F"/>
+          <w:sz w:val="18"/>
+          <w:szCs w:val="18"/>
+        </w:rPr>
+        <w:t xml:space="preserve">alertesFacture</w:t>
+      </w:r>
+      <w:r>
+        <w:t xml:space="preserve">).</w:t>
+      </w:r>
+    </w:p>
+    <w:p>
+      <w:pPr>
+        <w:pStyle w:val="ListParagraph"/>
+        <w:numPr>
+          <w:ilvl w:val="0"/>
+          <w:numId w:val="5"/>
+        </w:numPr>
+      </w:pPr>
+      <w:r>
+        <w:rPr>
+          <w:rFonts w:ascii="Consolas" w:cs="Consolas" w:eastAsia="Consolas" w:hAnsi="Consolas"/>
+          <w:color w:val="3B2F8F"/>
+          <w:sz w:val="18"/>
+          <w:szCs w:val="18"/>
+        </w:rPr>
+        <w:t xml:space="preserve">POST /api/factures/:id/validation</w:t>
+      </w:r>
+      <w:r>
+        <w:t xml:space="preserve"> : refus tant qu'une alerte n'est pas cochée ; entrée en réserve (</w:t>
+      </w:r>
+      <w:r>
+        <w:rPr>
+          <w:rFonts w:ascii="Consolas" w:cs="Consolas" w:eastAsia="Consolas" w:hAnsi="Consolas"/>
+          <w:color w:val="3B2F8F"/>
+          <w:sz w:val="18"/>
+          <w:szCs w:val="18"/>
+        </w:rPr>
+        <w:t xml:space="preserve">enregistrerLivraison</w:t>
+      </w:r>
+      <w:r>
+        <w:t xml:space="preserve">, coût moyen pondéré) des produits sans livraison, ni fabriqués, dans la limite d'un mouvement (100 000 unités) ; motif exigé s'il reste un écart ; journal technique.</w:t>
+      </w:r>
+    </w:p>
+    <w:p>
+      <w:pPr>
+        <w:pStyle w:val="ListParagraph"/>
+        <w:numPr>
+          <w:ilvl w:val="0"/>
+          <w:numId w:val="5"/>
+        </w:numPr>
+      </w:pPr>
+      <w:r>
+        <w:t xml:space="preserve">Paiement, puis </w:t>
+      </w:r>
+      <w:r>
+        <w:rPr>
+          <w:rFonts w:ascii="Consolas" w:cs="Consolas" w:eastAsia="Consolas" w:hAnsi="Consolas"/>
+          <w:color w:val="3B2F8F"/>
+          <w:sz w:val="18"/>
+          <w:szCs w:val="18"/>
+        </w:rPr>
+        <w:t xml:space="preserve">GET /api/factures/export</w:t>
+      </w:r>
+      <w:r>
+        <w:t xml:space="preserve"> pour le comptable.</w:t>
+      </w:r>
+    </w:p>
+    <w:p>
+      <w:r>
+        <w:rPr>
+          <w:b/>
+          <w:bCs/>
+        </w:rPr>
+        <w:t xml:space="preserve">Migrations de la période</w:t>
+      </w:r>
+      <w:r>
+        <w:t xml:space="preserve"> : </w:t>
+      </w:r>
+      <w:r>
+        <w:rPr>
+          <w:rFonts w:ascii="Consolas" w:cs="Consolas" w:eastAsia="Consolas" w:hAnsi="Consolas"/>
+          <w:color w:val="3B2F8F"/>
+          <w:sz w:val="18"/>
+          <w:szCs w:val="18"/>
+        </w:rPr>
+        <w:t xml:space="preserve">0054</w:t>
+      </w:r>
+      <w:r>
+        <w:t xml:space="preserve"> (annulation d'un import de caisse connectée), </w:t>
+      </w:r>
+      <w:r>
+        <w:rPr>
+          <w:rFonts w:ascii="Consolas" w:cs="Consolas" w:eastAsia="Consolas" w:hAnsi="Consolas"/>
+          <w:color w:val="3B2F8F"/>
+          <w:sz w:val="18"/>
+          <w:szCs w:val="18"/>
+        </w:rPr>
+        <w:t xml:space="preserve">0055</w:t>
+      </w:r>
+      <w:r>
+        <w:t xml:space="preserve"> (sortie de stock d'un événement privé), </w:t>
+      </w:r>
+      <w:r>
+        <w:rPr>
+          <w:rFonts w:ascii="Consolas" w:cs="Consolas" w:eastAsia="Consolas" w:hAnsi="Consolas"/>
+          <w:color w:val="3B2F8F"/>
+          <w:sz w:val="18"/>
+          <w:szCs w:val="18"/>
+        </w:rPr>
+        <w:t xml:space="preserve">0056</w:t>
+      </w:r>
+      <w:r>
+        <w:t xml:space="preserve"> (famille des catégories, système </w:t>
+      </w:r>
+      <w:r>
+        <w:rPr>
+          <w:rFonts w:ascii="Consolas" w:cs="Consolas" w:eastAsia="Consolas" w:hAnsi="Consolas"/>
+          <w:color w:val="3B2F8F"/>
+          <w:sz w:val="18"/>
+          <w:szCs w:val="18"/>
+        </w:rPr>
+        <w:t xml:space="preserve">breakeat</w:t>
+      </w:r>
+      <w:r>
+        <w:t xml:space="preserve">), </w:t>
+      </w:r>
+      <w:r>
+        <w:rPr>
+          <w:rFonts w:ascii="Consolas" w:cs="Consolas" w:eastAsia="Consolas" w:hAnsi="Consolas"/>
+          <w:color w:val="3B2F8F"/>
+          <w:sz w:val="18"/>
+          <w:szCs w:val="18"/>
+        </w:rPr>
+        <w:t xml:space="preserve">0057</w:t>
+      </w:r>
+      <w:r>
+        <w:t xml:space="preserve"> (colis, code article, total annoncé, correspondances fournisseurs), </w:t>
+      </w:r>
+      <w:r>
+        <w:rPr>
+          <w:rFonts w:ascii="Consolas" w:cs="Consolas" w:eastAsia="Consolas" w:hAnsi="Consolas"/>
+          <w:color w:val="3B2F8F"/>
+          <w:sz w:val="18"/>
+          <w:szCs w:val="18"/>
+        </w:rPr>
+        <w:t xml:space="preserve">0058</w:t>
+      </w:r>
+      <w:r>
+        <w:t xml:space="preserve"> (mode formation : famille et correspondances recopiées). </w:t>
+      </w:r>
+      <w:r>
+        <w:rPr>
+          <w:b/>
+          <w:bCs/>
+        </w:rPr>
+        <w:t xml:space="preserve">Dépendances ajoutées</w:t>
+      </w:r>
+      <w:r>
+        <w:t xml:space="preserve"> : </w:t>
+      </w:r>
+      <w:r>
+        <w:rPr>
+          <w:rFonts w:ascii="Consolas" w:cs="Consolas" w:eastAsia="Consolas" w:hAnsi="Consolas"/>
+          <w:color w:val="3B2F8F"/>
+          <w:sz w:val="18"/>
+          <w:szCs w:val="18"/>
+        </w:rPr>
+        <w:t xml:space="preserve">fflate</w:t>
+      </w:r>
+      <w:r>
+        <w:t xml:space="preserve"> 0.8.3 (zip) et </w:t>
+      </w:r>
+      <w:r>
+        <w:rPr>
+          <w:rFonts w:ascii="Consolas" w:cs="Consolas" w:eastAsia="Consolas" w:hAnsi="Consolas"/>
+          <w:color w:val="3B2F8F"/>
+          <w:sz w:val="18"/>
+          <w:szCs w:val="18"/>
+        </w:rPr>
+        <w:t xml:space="preserve">pdf-lib</w:t>
+      </w:r>
+      <w:r>
+        <w:t xml:space="preserve"> 1.17.1 (PDF), côté serveur.</w:t>
+      </w:r>
+    </w:p>
+    <w:p>
+      <w:pPr>
+        <w:pStyle w:val="Heading2"/>
+      </w:pPr>
+      <w:r>
         <w:t xml:space="preserve">6. Les tests</w:t>
       </w:r>
     </w:p>
@@ -2266,7 +4611,7 @@
         <w:pStyle w:val="ListParagraph"/>
         <w:numPr>
           <w:ilvl w:val="0"/>
-          <w:numId w:val="5"/>
+          <w:numId w:val="6"/>
         </w:numPr>
       </w:pPr>
       <w:r>
@@ -2302,7 +4647,7 @@
         <w:pStyle w:val="ListParagraph"/>
         <w:numPr>
           <w:ilvl w:val="0"/>
-          <w:numId w:val="5"/>
+          <w:numId w:val="6"/>
         </w:numPr>
       </w:pPr>
       <w:r>
@@ -2335,7 +4680,7 @@
         <w:pStyle w:val="ListParagraph"/>
         <w:numPr>
           <w:ilvl w:val="0"/>
-          <w:numId w:val="5"/>
+          <w:numId w:val="6"/>
         </w:numPr>
       </w:pPr>
       <w:r>
@@ -2366,7 +4711,7 @@
         <w:pStyle w:val="ListParagraph"/>
         <w:numPr>
           <w:ilvl w:val="0"/>
-          <w:numId w:val="5"/>
+          <w:numId w:val="6"/>
         </w:numPr>
       </w:pPr>
       <w:r>
@@ -3046,6 +5391,291 @@
           </w:p>
         </w:tc>
       </w:tr>
+      <w:tr>
+        <w:trPr>
+          <w:tblHeader w:val="false"/>
+        </w:trPr>
+        <w:tc>
+          <w:tcPr>
+            <w:tcW w:type="dxa" w:w="4819"/>
+            <w:tcBorders>
+              <w:top w:val="single" w:color="D9D3F7" w:sz="4"/>
+              <w:left w:val="single" w:color="D9D3F7" w:sz="4"/>
+              <w:bottom w:val="single" w:color="D9D3F7" w:sz="4"/>
+              <w:right w:val="single" w:color="D9D3F7" w:sz="4"/>
+            </w:tcBorders>
+            <w:tcMar>
+              <w:top w:type="dxa" w:w="50"/>
+              <w:left w:type="dxa" w:w="90"/>
+              <w:bottom w:type="dxa" w:w="50"/>
+              <w:right w:type="dxa" w:w="90"/>
+            </w:tcMar>
+          </w:tcPr>
+          <w:p>
+            <w:r>
+              <w:rPr>
+                <w:sz w:val="18"/>
+                <w:szCs w:val="18"/>
+              </w:rPr>
+              <w:t xml:space="preserve">Caisse connectée</w:t>
+            </w:r>
+          </w:p>
+        </w:tc>
+        <w:tc>
+          <w:tcPr>
+            <w:tcW w:type="dxa" w:w="4819"/>
+            <w:tcBorders>
+              <w:top w:val="single" w:color="D9D3F7" w:sz="4"/>
+              <w:left w:val="single" w:color="D9D3F7" w:sz="4"/>
+              <w:bottom w:val="single" w:color="D9D3F7" w:sz="4"/>
+              <w:right w:val="single" w:color="D9D3F7" w:sz="4"/>
+            </w:tcBorders>
+            <w:tcMar>
+              <w:top w:type="dxa" w:w="50"/>
+              <w:left w:type="dxa" w:w="90"/>
+              <w:bottom w:type="dxa" w:w="50"/>
+              <w:right w:type="dxa" w:w="90"/>
+            </w:tcMar>
+          </w:tcPr>
+          <w:p>
+            <w:r>
+              <w:rPr>
+                <w:sz w:val="18"/>
+                <w:szCs w:val="18"/>
+              </w:rPr>
+              <w:t xml:space="preserve">Une caisse d'un autre logiciel (L'Addition, Weezevent, Click &amp; Collect Break Eat…) dont les ventes sont importées par fichier : comptées en gestion, jamais dans les Z ni l'export comptable.</w:t>
+            </w:r>
+          </w:p>
+        </w:tc>
+      </w:tr>
+      <w:tr>
+        <w:trPr>
+          <w:tblHeader w:val="false"/>
+        </w:trPr>
+        <w:tc>
+          <w:tcPr>
+            <w:tcW w:type="dxa" w:w="4819"/>
+            <w:tcBorders>
+              <w:top w:val="single" w:color="D9D3F7" w:sz="4"/>
+              <w:left w:val="single" w:color="D9D3F7" w:sz="4"/>
+              <w:bottom w:val="single" w:color="D9D3F7" w:sz="4"/>
+              <w:right w:val="single" w:color="D9D3F7" w:sz="4"/>
+            </w:tcBorders>
+            <w:tcMar>
+              <w:top w:type="dxa" w:w="50"/>
+              <w:left w:type="dxa" w:w="90"/>
+              <w:bottom w:type="dxa" w:w="50"/>
+              <w:right w:type="dxa" w:w="90"/>
+            </w:tcMar>
+          </w:tcPr>
+          <w:p>
+            <w:r>
+              <w:rPr>
+                <w:sz w:val="18"/>
+                <w:szCs w:val="18"/>
+              </w:rPr>
+              <w:t xml:space="preserve">Colis, unités par colis</w:t>
+            </w:r>
+          </w:p>
+        </w:tc>
+        <w:tc>
+          <w:tcPr>
+            <w:tcW w:type="dxa" w:w="4819"/>
+            <w:tcBorders>
+              <w:top w:val="single" w:color="D9D3F7" w:sz="4"/>
+              <w:left w:val="single" w:color="D9D3F7" w:sz="4"/>
+              <w:bottom w:val="single" w:color="D9D3F7" w:sz="4"/>
+              <w:right w:val="single" w:color="D9D3F7" w:sz="4"/>
+            </w:tcBorders>
+            <w:tcMar>
+              <w:top w:type="dxa" w:w="50"/>
+              <w:left w:type="dxa" w:w="90"/>
+              <w:bottom w:type="dxa" w:w="50"/>
+              <w:right w:type="dxa" w:w="90"/>
+            </w:tcMar>
+          </w:tcPr>
+          <w:p>
+            <w:r>
+              <w:rPr>
+                <w:sz w:val="18"/>
+                <w:szCs w:val="18"/>
+              </w:rPr>
+              <w:t xml:space="preserve">Une ligne de facture compte des unités facturées (colis de 24) ; la réserve reçoit quantité × colis.</w:t>
+            </w:r>
+          </w:p>
+        </w:tc>
+      </w:tr>
+      <w:tr>
+        <w:trPr>
+          <w:tblHeader w:val="false"/>
+        </w:trPr>
+        <w:tc>
+          <w:tcPr>
+            <w:tcW w:type="dxa" w:w="4819"/>
+            <w:tcBorders>
+              <w:top w:val="single" w:color="D9D3F7" w:sz="4"/>
+              <w:left w:val="single" w:color="D9D3F7" w:sz="4"/>
+              <w:bottom w:val="single" w:color="D9D3F7" w:sz="4"/>
+              <w:right w:val="single" w:color="D9D3F7" w:sz="4"/>
+            </w:tcBorders>
+            <w:tcMar>
+              <w:top w:type="dxa" w:w="50"/>
+              <w:left w:type="dxa" w:w="90"/>
+              <w:bottom w:type="dxa" w:w="50"/>
+              <w:right w:type="dxa" w:w="90"/>
+            </w:tcMar>
+          </w:tcPr>
+          <w:p>
+            <w:r>
+              <w:rPr>
+                <w:sz w:val="18"/>
+                <w:szCs w:val="18"/>
+              </w:rPr>
+              <w:t xml:space="preserve">Correspondance fournisseur</w:t>
+            </w:r>
+          </w:p>
+        </w:tc>
+        <w:tc>
+          <w:tcPr>
+            <w:tcW w:type="dxa" w:w="4819"/>
+            <w:tcBorders>
+              <w:top w:val="single" w:color="D9D3F7" w:sz="4"/>
+              <w:left w:val="single" w:color="D9D3F7" w:sz="4"/>
+              <w:bottom w:val="single" w:color="D9D3F7" w:sz="4"/>
+              <w:right w:val="single" w:color="D9D3F7" w:sz="4"/>
+            </w:tcBorders>
+            <w:tcMar>
+              <w:top w:type="dxa" w:w="50"/>
+              <w:left w:type="dxa" w:w="90"/>
+              <w:bottom w:type="dxa" w:w="50"/>
+              <w:right w:type="dxa" w:w="90"/>
+            </w:tcMar>
+          </w:tcPr>
+          <w:p>
+            <w:r>
+              <w:rPr>
+                <w:sz w:val="18"/>
+                <w:szCs w:val="18"/>
+              </w:rPr>
+              <w:t xml:space="preserve">« Tel article chez tel fournisseur = tel produit, en colis de tant », apprise à chaque facture, corrigée dans Achats.</w:t>
+            </w:r>
+          </w:p>
+        </w:tc>
+      </w:tr>
+      <w:tr>
+        <w:trPr>
+          <w:tblHeader w:val="false"/>
+        </w:trPr>
+        <w:tc>
+          <w:tcPr>
+            <w:tcW w:type="dxa" w:w="4819"/>
+            <w:tcBorders>
+              <w:top w:val="single" w:color="D9D3F7" w:sz="4"/>
+              <w:left w:val="single" w:color="D9D3F7" w:sz="4"/>
+              <w:bottom w:val="single" w:color="D9D3F7" w:sz="4"/>
+              <w:right w:val="single" w:color="D9D3F7" w:sz="4"/>
+            </w:tcBorders>
+            <w:tcMar>
+              <w:top w:type="dxa" w:w="50"/>
+              <w:left w:type="dxa" w:w="90"/>
+              <w:bottom w:type="dxa" w:w="50"/>
+              <w:right w:type="dxa" w:w="90"/>
+            </w:tcMar>
+          </w:tcPr>
+          <w:p>
+            <w:r>
+              <w:rPr>
+                <w:sz w:val="18"/>
+                <w:szCs w:val="18"/>
+              </w:rPr>
+              <w:t xml:space="preserve">Famille</w:t>
+            </w:r>
+          </w:p>
+        </w:tc>
+        <w:tc>
+          <w:tcPr>
+            <w:tcW w:type="dxa" w:w="4819"/>
+            <w:tcBorders>
+              <w:top w:val="single" w:color="D9D3F7" w:sz="4"/>
+              <w:left w:val="single" w:color="D9D3F7" w:sz="4"/>
+              <w:bottom w:val="single" w:color="D9D3F7" w:sz="4"/>
+              <w:right w:val="single" w:color="D9D3F7" w:sz="4"/>
+            </w:tcBorders>
+            <w:tcMar>
+              <w:top w:type="dxa" w:w="50"/>
+              <w:left w:type="dxa" w:w="90"/>
+              <w:bottom w:type="dxa" w:w="50"/>
+              <w:right w:type="dxa" w:w="90"/>
+            </w:tcMar>
+          </w:tcPr>
+          <w:p>
+            <w:r>
+              <w:rPr>
+                <w:sz w:val="18"/>
+                <w:szCs w:val="18"/>
+              </w:rPr>
+              <w:t xml:space="preserve">Boisson, nourriture ou autre : regroupe les catégories pour la part boissons / nourriture de Résultats.</w:t>
+            </w:r>
+          </w:p>
+        </w:tc>
+      </w:tr>
+      <w:tr>
+        <w:trPr>
+          <w:tblHeader w:val="false"/>
+        </w:trPr>
+        <w:tc>
+          <w:tcPr>
+            <w:tcW w:type="dxa" w:w="4819"/>
+            <w:tcBorders>
+              <w:top w:val="single" w:color="D9D3F7" w:sz="4"/>
+              <w:left w:val="single" w:color="D9D3F7" w:sz="4"/>
+              <w:bottom w:val="single" w:color="D9D3F7" w:sz="4"/>
+              <w:right w:val="single" w:color="D9D3F7" w:sz="4"/>
+            </w:tcBorders>
+            <w:tcMar>
+              <w:top w:type="dxa" w:w="50"/>
+              <w:left w:type="dxa" w:w="90"/>
+              <w:bottom w:type="dxa" w:w="50"/>
+              <w:right w:type="dxa" w:w="90"/>
+            </w:tcMar>
+          </w:tcPr>
+          <w:p>
+            <w:r>
+              <w:rPr>
+                <w:sz w:val="18"/>
+                <w:szCs w:val="18"/>
+              </w:rPr>
+              <w:t xml:space="preserve">Événement terminé</w:t>
+            </w:r>
+          </w:p>
+        </w:tc>
+        <w:tc>
+          <w:tcPr>
+            <w:tcW w:type="dxa" w:w="4819"/>
+            <w:tcBorders>
+              <w:top w:val="single" w:color="D9D3F7" w:sz="4"/>
+              <w:left w:val="single" w:color="D9D3F7" w:sz="4"/>
+              <w:bottom w:val="single" w:color="D9D3F7" w:sz="4"/>
+              <w:right w:val="single" w:color="D9D3F7" w:sz="4"/>
+            </w:tcBorders>
+            <w:tcMar>
+              <w:top w:type="dxa" w:w="50"/>
+              <w:left w:type="dxa" w:w="90"/>
+              <w:bottom w:type="dxa" w:w="50"/>
+              <w:right w:type="dxa" w:w="90"/>
+            </w:tcMar>
+          </w:tcPr>
+          <w:p>
+            <w:r>
+              <w:rPr>
+                <w:sz w:val="18"/>
+                <w:szCs w:val="18"/>
+              </w:rPr>
+              <w:t xml:space="preserve">Clos, ou (lieu à caisse connectée) commencé et avec des ventes : ce que Résultats montre.</w:t>
+            </w:r>
+          </w:p>
+        </w:tc>
+      </w:tr>
     </w:tbl>
     <w:p/>
     <w:p>
@@ -3054,6 +5684,42 @@
       </w:pPr>
       <w:r>
         <w:t xml:space="preserve">9. Ce qui reste ouvert</w:t>
+      </w:r>
+    </w:p>
+    <w:p>
+      <w:pPr>
+        <w:pStyle w:val="ListParagraph"/>
+        <w:numPr>
+          <w:ilvl w:val="0"/>
+          <w:numId w:val="2"/>
+        </w:numPr>
+      </w:pPr>
+      <w:r>
+        <w:t xml:space="preserve">La liste à jour : </w:t>
+      </w:r>
+      <w:r>
+        <w:rPr>
+          <w:rFonts w:ascii="Consolas" w:cs="Consolas" w:eastAsia="Consolas" w:hAnsi="Consolas"/>
+          <w:color w:val="3B2F8F"/>
+          <w:sz w:val="18"/>
+          <w:szCs w:val="18"/>
+        </w:rPr>
+        <w:t xml:space="preserve">docs/points-a-revoir.md</w:t>
+      </w:r>
+      <w:r>
+        <w:t xml:space="preserve"> (dont la lecture des factures PDF par IA, Mistral OCR, qui attend le compte de Rémi) ; les points ouverts de l'audit : § 6 de </w:t>
+      </w:r>
+      <w:r>
+        <w:rPr>
+          <w:rFonts w:ascii="Consolas" w:cs="Consolas" w:eastAsia="Consolas" w:hAnsi="Consolas"/>
+          <w:color w:val="3B2F8F"/>
+          <w:sz w:val="18"/>
+          <w:szCs w:val="18"/>
+        </w:rPr>
+        <w:t xml:space="preserve">AUDIT_2026-10-25_claude-phases-67-75.md</w:t>
+      </w:r>
+      <w:r>
+        <w:t xml:space="preserve">.</w:t>
       </w:r>
     </w:p>
     <w:p>
@@ -3244,7 +5910,7 @@
         <w:sz w:val="16"/>
         <w:szCs w:val="16"/>
       </w:rPr>
-      <w:t xml:space="preserve">FlaiX Expert — Guide de reprise</w:t>
+      <w:t xml:space="preserve">FlaiX Expert — guide de reprise pour un développeur</w:t>
     </w:r>
   </w:p>
 </w:hdr>
@@ -3382,6 +6048,18 @@
     </w:lvl>
   </w:abstractNum>
   <w:abstractNum w:abstractNumId="5" w15:restartNumberingAfterBreak="0">
+    <w:multiLevelType w:val="hybridMultilevel"/>
+    <w:lvl w:ilvl="0" w15:tentative="1">
+      <w:start w:val="1"/>
+      <w:numFmt w:val="decimal"/>
+      <w:lvlText w:val="%1."/>
+      <w:lvlJc w:val="left"/>
+      <w:pPr>
+        <w:ind w:left="540" w:hanging="300"/>
+      </w:pPr>
+    </w:lvl>
+  </w:abstractNum>
+  <w:abstractNum w:abstractNumId="6" w15:restartNumberingAfterBreak="0">
     <w:multiLevelType w:val="hybridMultilevel"/>
     <w:lvl w:ilvl="0" w15:tentative="1">
       <w:start w:val="1"/>
@@ -3419,6 +6097,12 @@
   </w:num>
   <w:num w:numId="5">
     <w:abstractNumId w:val="5"/>
+    <w:lvlOverride w:ilvl="0">
+      <w:startOverride w:val="1"/>
+    </w:lvlOverride>
+  </w:num>
+  <w:num w:numId="6">
+    <w:abstractNumId w:val="6"/>
     <w:lvlOverride w:ilvl="0">
       <w:startOverride w:val="1"/>
     </w:lvlOverride>

</xml_diff>